<commit_message>
ADDED REFERENCES AND INCLUDED INTRODUCTION
</commit_message>
<xml_diff>
--- a/DRAFT REPORT.docx
+++ b/DRAFT REPORT.docx
@@ -109,7 +109,7 @@
           <w:r>
             <w:fldChar w:fldCharType="separate"/>
           </w:r>
-          <w:hyperlink w:anchor="_Toc240218493" w:history="1">
+          <w:hyperlink w:anchor="_Toc240650084" w:history="1">
             <w:r>
               <w:rPr>
                 <w:rStyle w:val="Hyperlink"/>
@@ -137,7 +137,7 @@
                 <w:noProof/>
                 <w:webHidden/>
               </w:rPr>
-              <w:instrText xml:space="preserve"> PAGEREF _Toc240218493 \h </w:instrText>
+              <w:instrText xml:space="preserve"> PAGEREF _Toc240650084 \h </w:instrText>
             </w:r>
             <w:r>
               <w:rPr>
@@ -180,13 +180,13 @@
               <w:lang w:eastAsia="en-MY"/>
             </w:rPr>
           </w:pPr>
-          <w:hyperlink w:anchor="_Toc240218494" w:history="1">
+          <w:hyperlink w:anchor="_Toc240650085" w:history="1">
             <w:r>
               <w:rPr>
                 <w:rStyle w:val="Hyperlink"/>
                 <w:noProof/>
               </w:rPr>
-              <w:t>Introduction</w:t>
+              <w:t>Executive Summary</w:t>
             </w:r>
             <w:r>
               <w:rPr>
@@ -207,7 +207,7 @@
                 <w:noProof/>
                 <w:webHidden/>
               </w:rPr>
-              <w:instrText xml:space="preserve"> PAGEREF _Toc240218494 \h </w:instrText>
+              <w:instrText xml:space="preserve"> PAGEREF _Toc240650085 \h </w:instrText>
             </w:r>
             <w:r>
               <w:rPr>
@@ -250,13 +250,13 @@
               <w:lang w:eastAsia="en-MY"/>
             </w:rPr>
           </w:pPr>
-          <w:hyperlink w:anchor="_Toc240218495" w:history="1">
+          <w:hyperlink w:anchor="_Toc240650086" w:history="1">
             <w:r>
               <w:rPr>
                 <w:rStyle w:val="Hyperlink"/>
                 <w:noProof/>
               </w:rPr>
-              <w:t>References</w:t>
+              <w:t>Introduction</w:t>
             </w:r>
             <w:r>
               <w:rPr>
@@ -277,7 +277,7 @@
                 <w:noProof/>
                 <w:webHidden/>
               </w:rPr>
-              <w:instrText xml:space="preserve"> PAGEREF _Toc240218495 \h </w:instrText>
+              <w:instrText xml:space="preserve"> PAGEREF _Toc240650086 \h </w:instrText>
             </w:r>
             <w:r>
               <w:rPr>
@@ -309,6 +309,217 @@
           </w:hyperlink>
         </w:p>
         <w:p>
+          <w:pPr>
+            <w:pStyle w:val="TOC1"/>
+            <w:tabs>
+              <w:tab w:val="right" w:leader="dot" w:pos="9016"/>
+            </w:tabs>
+            <w:rPr>
+              <w:rFonts w:eastAsiaTheme="minorEastAsia"/>
+              <w:noProof/>
+              <w:lang w:eastAsia="en-MY"/>
+            </w:rPr>
+          </w:pPr>
+          <w:hyperlink w:anchor="_Toc240650087" w:history="1">
+            <w:r>
+              <w:rPr>
+                <w:rStyle w:val="Hyperlink"/>
+                <w:noProof/>
+              </w:rPr>
+              <w:t>Findings</w:t>
+            </w:r>
+            <w:r>
+              <w:rPr>
+                <w:noProof/>
+                <w:webHidden/>
+              </w:rPr>
+              <w:tab/>
+            </w:r>
+            <w:r>
+              <w:rPr>
+                <w:noProof/>
+                <w:webHidden/>
+              </w:rPr>
+              <w:fldChar w:fldCharType="begin"/>
+            </w:r>
+            <w:r>
+              <w:rPr>
+                <w:noProof/>
+                <w:webHidden/>
+              </w:rPr>
+              <w:instrText xml:space="preserve"> PAGEREF _Toc240650087 \h </w:instrText>
+            </w:r>
+            <w:r>
+              <w:rPr>
+                <w:noProof/>
+                <w:webHidden/>
+              </w:rPr>
+            </w:r>
+            <w:r>
+              <w:rPr>
+                <w:noProof/>
+                <w:webHidden/>
+              </w:rPr>
+              <w:fldChar w:fldCharType="separate"/>
+            </w:r>
+            <w:r>
+              <w:rPr>
+                <w:noProof/>
+                <w:webHidden/>
+              </w:rPr>
+              <w:t>6</w:t>
+            </w:r>
+            <w:r>
+              <w:rPr>
+                <w:noProof/>
+                <w:webHidden/>
+              </w:rPr>
+              <w:fldChar w:fldCharType="end"/>
+            </w:r>
+          </w:hyperlink>
+        </w:p>
+        <w:p>
+          <w:pPr>
+            <w:pStyle w:val="TOC1"/>
+            <w:tabs>
+              <w:tab w:val="right" w:leader="dot" w:pos="9016"/>
+            </w:tabs>
+            <w:rPr>
+              <w:rFonts w:eastAsiaTheme="minorEastAsia"/>
+              <w:noProof/>
+              <w:lang w:eastAsia="en-MY"/>
+            </w:rPr>
+          </w:pPr>
+          <w:hyperlink w:anchor="_Toc240650088" w:history="1">
+            <w:r>
+              <w:rPr>
+                <w:rStyle w:val="Hyperlink"/>
+                <w:noProof/>
+              </w:rPr>
+              <w:t>References</w:t>
+            </w:r>
+            <w:r>
+              <w:rPr>
+                <w:noProof/>
+                <w:webHidden/>
+              </w:rPr>
+              <w:tab/>
+            </w:r>
+            <w:r>
+              <w:rPr>
+                <w:noProof/>
+                <w:webHidden/>
+              </w:rPr>
+              <w:fldChar w:fldCharType="begin"/>
+            </w:r>
+            <w:r>
+              <w:rPr>
+                <w:noProof/>
+                <w:webHidden/>
+              </w:rPr>
+              <w:instrText xml:space="preserve"> PAGEREF _Toc240650088 \h </w:instrText>
+            </w:r>
+            <w:r>
+              <w:rPr>
+                <w:noProof/>
+                <w:webHidden/>
+              </w:rPr>
+            </w:r>
+            <w:r>
+              <w:rPr>
+                <w:noProof/>
+                <w:webHidden/>
+              </w:rPr>
+              <w:fldChar w:fldCharType="separate"/>
+            </w:r>
+            <w:r>
+              <w:rPr>
+                <w:noProof/>
+                <w:webHidden/>
+              </w:rPr>
+              <w:t>7</w:t>
+            </w:r>
+            <w:r>
+              <w:rPr>
+                <w:noProof/>
+                <w:webHidden/>
+              </w:rPr>
+              <w:fldChar w:fldCharType="end"/>
+            </w:r>
+          </w:hyperlink>
+        </w:p>
+        <w:p>
+          <w:pPr>
+            <w:pStyle w:val="TOC1"/>
+            <w:tabs>
+              <w:tab w:val="right" w:leader="dot" w:pos="9016"/>
+            </w:tabs>
+            <w:rPr>
+              <w:rFonts w:eastAsiaTheme="minorEastAsia"/>
+              <w:noProof/>
+              <w:lang w:eastAsia="en-MY"/>
+            </w:rPr>
+          </w:pPr>
+          <w:hyperlink w:anchor="_Toc240650089" w:history="1">
+            <w:r>
+              <w:rPr>
+                <w:rStyle w:val="Hyperlink"/>
+                <w:noProof/>
+                <w:lang w:val="en-US"/>
+              </w:rPr>
+              <w:t>Recommendation</w:t>
+            </w:r>
+            <w:r>
+              <w:rPr>
+                <w:noProof/>
+                <w:webHidden/>
+              </w:rPr>
+              <w:tab/>
+            </w:r>
+            <w:r>
+              <w:rPr>
+                <w:noProof/>
+                <w:webHidden/>
+              </w:rPr>
+              <w:fldChar w:fldCharType="begin"/>
+            </w:r>
+            <w:r>
+              <w:rPr>
+                <w:noProof/>
+                <w:webHidden/>
+              </w:rPr>
+              <w:instrText xml:space="preserve"> PAGEREF _Toc240650089 \h </w:instrText>
+            </w:r>
+            <w:r>
+              <w:rPr>
+                <w:noProof/>
+                <w:webHidden/>
+              </w:rPr>
+            </w:r>
+            <w:r>
+              <w:rPr>
+                <w:noProof/>
+                <w:webHidden/>
+              </w:rPr>
+              <w:fldChar w:fldCharType="separate"/>
+            </w:r>
+            <w:r>
+              <w:rPr>
+                <w:noProof/>
+                <w:webHidden/>
+              </w:rPr>
+              <w:t>18</w:t>
+            </w:r>
+            <w:r>
+              <w:rPr>
+                <w:noProof/>
+                <w:webHidden/>
+              </w:rPr>
+              <w:fldChar w:fldCharType="end"/>
+            </w:r>
+          </w:hyperlink>
+        </w:p>
+        <w:p>
           <w:r>
             <w:rPr>
               <w:b/>
@@ -332,7 +543,7 @@
           <w:lang w:val="en-US"/>
         </w:rPr>
       </w:pPr>
-      <w:bookmarkStart w:id="0" w:name="_Toc240218493"/>
+      <w:bookmarkStart w:id="0" w:name="_Toc240650084"/>
       <w:r>
         <w:rPr>
           <w:lang w:val="en-US"/>
@@ -478,6 +689,38 @@
     <w:p>
       <w:pPr>
         <w:pStyle w:val="ListParagraph"/>
+        <w:numPr>
+          <w:ilvl w:val="0"/>
+          <w:numId w:val="3"/>
+        </w:numPr>
+        <w:rPr>
+          <w:highlight w:val="yellow"/>
+        </w:rPr>
+      </w:pPr>
+      <w:r>
+        <w:rPr>
+          <w:highlight w:val="yellow"/>
+        </w:rPr>
+        <w:t xml:space="preserve">Take over </w:t>
+      </w:r>
+      <w:proofErr w:type="spellStart"/>
+      <w:r>
+        <w:rPr>
+          <w:highlight w:val="yellow"/>
+        </w:rPr>
+        <w:t>ppls</w:t>
+      </w:r>
+      <w:proofErr w:type="spellEnd"/>
+      <w:r>
+        <w:rPr>
+          <w:highlight w:val="yellow"/>
+        </w:rPr>
+        <w:t xml:space="preserve"> jobs?</w:t>
+      </w:r>
+    </w:p>
+    <w:p>
+      <w:pPr>
+        <w:pStyle w:val="ListParagraph"/>
       </w:pPr>
     </w:p>
     <w:p>
@@ -516,7 +759,50 @@
       </w:r>
     </w:p>
     <w:p>
-      <w:bookmarkStart w:id="1" w:name="_Toc240218494"/>
+      <w:pPr>
+        <w:pStyle w:val="Heading1"/>
+        <w:rPr>
+          <w:rStyle w:val="Heading1Char"/>
+        </w:rPr>
+      </w:pPr>
+      <w:bookmarkStart w:id="1" w:name="_Toc240650085"/>
+      <w:r>
+        <w:rPr>
+          <w:rStyle w:val="Heading1Char"/>
+        </w:rPr>
+        <w:lastRenderedPageBreak/>
+        <w:t>Executive Summary</w:t>
+      </w:r>
+      <w:bookmarkEnd w:id="1"/>
+      <w:r>
+        <w:rPr>
+          <w:rStyle w:val="Heading1Char"/>
+        </w:rPr>
+        <w:t xml:space="preserve"> </w:t>
+      </w:r>
+    </w:p>
+    <w:p>
+      <w:pPr>
+        <w:rPr>
+          <w:rStyle w:val="Heading1Char"/>
+        </w:rPr>
+      </w:pPr>
+    </w:p>
+    <w:p>
+      <w:pPr>
+        <w:rPr>
+          <w:rStyle w:val="Heading1Char"/>
+        </w:rPr>
+      </w:pPr>
+      <w:r>
+        <w:rPr>
+          <w:rStyle w:val="Heading1Char"/>
+        </w:rPr>
+        <w:br w:type="page"/>
+      </w:r>
+    </w:p>
+    <w:p>
+      <w:bookmarkStart w:id="2" w:name="_Toc240650086"/>
       <w:r>
         <w:rPr>
           <w:rStyle w:val="Heading1Char"/>
@@ -524,7 +810,7 @@
         <w:lastRenderedPageBreak/>
         <w:t>Introduction</w:t>
       </w:r>
-      <w:bookmarkEnd w:id="1"/>
+      <w:bookmarkEnd w:id="2"/>
       <w:r>
         <w:t xml:space="preserve"> </w:t>
       </w:r>
@@ -536,21 +822,204 @@
       </w:r>
     </w:p>
     <w:p/>
+    <w:p/>
+    <w:p>
+      <w:r>
+        <w:t xml:space="preserve">Artificial Intelligence (AI), i.e., computing machines designed to mimic multiple human intelligences such as the capabilities to do, think, and feel that </w:t>
+      </w:r>
+      <w:proofErr w:type="gramStart"/>
+      <w:r>
+        <w:t>are able to</w:t>
+      </w:r>
+      <w:proofErr w:type="gramEnd"/>
+      <w:r>
+        <w:t xml:space="preserve"> interpret external data, learn from such data, and use those learnings to achieve specific goals and tasks through flexible adaptation</w:t>
+      </w:r>
+      <w:r>
+        <w:t xml:space="preserve"> [1]. </w:t>
+      </w:r>
+      <w:r>
+        <w:t xml:space="preserve">Such amplification can go in positive as well as negative directions. On the positive side, AI helps companies to spot unethical </w:t>
+      </w:r>
+      <w:proofErr w:type="spellStart"/>
+      <w:r>
+        <w:t>behavior</w:t>
+      </w:r>
+      <w:proofErr w:type="spellEnd"/>
+      <w:r>
+        <w:t xml:space="preserve"> that previously might have been unnoticed.</w:t>
+      </w:r>
+      <w:r>
+        <w:t xml:space="preserve"> On the negative side, AI can raise</w:t>
+      </w:r>
+      <w:r>
+        <w:t xml:space="preserve"> ethical concerns and alters company-employee relationships.</w:t>
+      </w:r>
+      <w:r>
+        <w:t xml:space="preserve"> </w:t>
+      </w:r>
+    </w:p>
+    <w:p>
+      <w:r>
+        <w:t xml:space="preserve">Artificial intelligence (AI) is causing a revolution in business as well as the economy and society </w:t>
+      </w:r>
+      <w:proofErr w:type="gramStart"/>
+      <w:r>
+        <w:t>as a whole by</w:t>
+      </w:r>
+      <w:proofErr w:type="gramEnd"/>
+      <w:r>
+        <w:t xml:space="preserve"> changing the interactions and relationships that exist between stakeholders and individuals</w:t>
+      </w:r>
+      <w:r>
+        <w:t xml:space="preserve"> [</w:t>
+      </w:r>
+      <w:r>
+        <w:t>2</w:t>
+      </w:r>
+      <w:r>
+        <w:t>]</w:t>
+      </w:r>
+      <w:r>
+        <w:t xml:space="preserve">. </w:t>
+      </w:r>
+      <w:r>
+        <w:t>AI affects customers, businesses, and stakeholders in an increasingly automated and interconnected business world</w:t>
+      </w:r>
+      <w:r>
+        <w:t xml:space="preserve">. AI is used to handle customer interaction, store and manage data, handle company statistics and act as a database for employees. However, issues can rise between employees and the company especially for ethics. </w:t>
+      </w:r>
+      <w:r>
+        <w:t xml:space="preserve">Issues </w:t>
+      </w:r>
+      <w:r>
+        <w:t xml:space="preserve">can arise within the company based on how the company handles these issues ethically. </w:t>
+      </w:r>
+      <w:r>
+        <w:t xml:space="preserve">This report will focus on finding the issues between ethics and business and ai especially during the rise of ai. </w:t>
+      </w:r>
+    </w:p>
+    <w:p/>
+    <w:p>
+      <w:r>
+        <w:t>~~</w:t>
+      </w:r>
+    </w:p>
+    <w:p/>
+    <w:p>
+      <w:r>
+        <w:t>Artificial Intelligence (AI) has become an increasingly significant technology in modern organisations, influencing the way businesses operate, make decisions, and interact with their stakeholders. AI can be described as computing machines designed to mimic multiple forms of human intelligence, including the capabilities to perform tasks, think, interpret external data, learn from that data, and use those learnings to achieve specific goals through flexible adaptation [1]. As AI continues to develop, its influence is expanding beyond technical applications and becoming increasingly integrated into everyday business activities. Organisations are adopting AI to improve efficiency, reduce operational costs, support decision-making, manage large amounts of information, and provide faster and more personalised services. However, the increasing adoption of AI also creates questions about how businesses can balance the benefits of these technologies with their ethical responsibilities towards employees, customers, and other stakeholders.</w:t>
+      </w:r>
+      <w:r>
+        <w:t xml:space="preserve"> </w:t>
+      </w:r>
+      <w:r>
+        <w:t xml:space="preserve">The impact of AI on organisations can result in both positive and negative outcomes. On the positive side, AI can support businesses in </w:t>
+      </w:r>
+      <w:r>
+        <w:lastRenderedPageBreak/>
+        <w:t>identifying unethical or inappropriate behaviour that may previously have gone unnoticed</w:t>
+      </w:r>
+      <w:r>
+        <w:t xml:space="preserve">. </w:t>
+      </w:r>
+      <w:r>
+        <w:t>However, the same technology can also create new ethical concerns. The ability of AI to collect, analyse, and make decisions based on large quantities of data means that organisations must consider how these systems affect individual privacy, autonomy, fairness, and accountability.</w:t>
+      </w:r>
+      <w:r>
+        <w:t xml:space="preserve"> </w:t>
+      </w:r>
+      <w:r>
+        <w:t xml:space="preserve">Artificial intelligence is causing a significant transformation in business, the economy, and society </w:t>
+      </w:r>
+      <w:proofErr w:type="gramStart"/>
+      <w:r>
+        <w:t>as a whole by</w:t>
+      </w:r>
+      <w:proofErr w:type="gramEnd"/>
+      <w:r>
+        <w:t xml:space="preserve"> changing the interactions and relationships between individuals and stakeholders [2]. AI increasingly affects customers, employees, businesses, and other stakeholders within </w:t>
+      </w:r>
+      <w:r>
+        <w:t xml:space="preserve">a </w:t>
+      </w:r>
+      <w:r>
+        <w:t>business environment. Organisations use AI for a wide range of purposes, including handling customer interactions, storing and managing data, analysing company statistics, supporting business decisions, and providing employees with access to information</w:t>
+      </w:r>
+      <w:r>
+        <w:t xml:space="preserve">. </w:t>
+      </w:r>
+      <w:r>
+        <w:t>The tension between business objectives and ethical considerations becomes particularly important when organisations prioritise the benefits of AI, such as increased productivity, reduced costs, and improved competitiveness. Businesses naturally have an interest in adopting technologies that can provide these advantages. However, an organisation's responsibility does not necessarily end with achieving its commercial objectives. The implementation of AI may involve sensitive employee or customer information, automated decision-making, and systems whose outputs may not always be accurate or transparent. If these concerns are not properly addressed, businesses may face ethical problems involving privacy, consent, fairness, accountability, and trust. Therefore, the question is not simply whether businesses should use AI, but how AI can be implemented in a way that considers both organisational interests and the rights and expectations of stakeholders.</w:t>
+      </w:r>
+      <w:r>
+        <w:t xml:space="preserve"> </w:t>
+      </w:r>
+      <w:r>
+        <w:t>The rise of AI therefore presents businesses with a complex challenge. While AI can provide significant opportunities for organisations, its use also introduces ethical responsibilities that businesses must consider when developing and implementing AI systems. This report will investigate and analyse the tension between ethics and business in the use of Artificial Intelligence. It will examine how the adoption of AI can create ethical challenges for organisations while also providing important business benefits. Through this analysis, the report will consider how organisations can balance the opportunities offered by AI with the ethical responsibilities that arise from its increasing use.</w:t>
+      </w:r>
+    </w:p>
     <w:p>
       <w:r>
         <w:br w:type="page"/>
       </w:r>
     </w:p>
     <w:p>
+      <w:bookmarkStart w:id="3" w:name="_Toc240650087"/>
+      <w:proofErr w:type="gramStart"/>
+      <w:r>
+        <w:rPr>
+          <w:rStyle w:val="Heading1Char"/>
+        </w:rPr>
+        <w:lastRenderedPageBreak/>
+        <w:t>F</w:t>
+      </w:r>
+      <w:r>
+        <w:rPr>
+          <w:rStyle w:val="Heading1Char"/>
+        </w:rPr>
+        <w:t>indings</w:t>
+      </w:r>
+      <w:bookmarkEnd w:id="3"/>
+      <w:r>
+        <w:rPr>
+          <w:rStyle w:val="Heading1Char"/>
+        </w:rPr>
+        <w:t xml:space="preserve"> </w:t>
+      </w:r>
+      <w:r>
+        <w:t xml:space="preserve"> ~</w:t>
+      </w:r>
+      <w:proofErr w:type="gramEnd"/>
+      <w:r>
+        <w:t xml:space="preserve"> </w:t>
+      </w:r>
+      <w:r>
+        <w:t>1,800-2,500 words</w:t>
+      </w:r>
+    </w:p>
+    <w:p/>
+    <w:p>
+      <w:r>
+        <w:t>dd</w:t>
+      </w:r>
+    </w:p>
+    <w:p/>
+    <w:p>
+      <w:r>
+        <w:br w:type="page"/>
+      </w:r>
+    </w:p>
+    <w:p>
       <w:pPr>
         <w:pStyle w:val="Heading1"/>
       </w:pPr>
-      <w:bookmarkStart w:id="2" w:name="_Toc240218495"/>
+      <w:bookmarkStart w:id="4" w:name="_Toc240650088"/>
       <w:r>
         <w:lastRenderedPageBreak/>
         <w:t>References</w:t>
       </w:r>
-      <w:bookmarkEnd w:id="2"/>
+      <w:bookmarkEnd w:id="4"/>
     </w:p>
     <w:p/>
     <w:p>
@@ -559,6 +1028,168 @@
       </w:r>
       <w:r>
         <w:t>:</w:t>
+      </w:r>
+    </w:p>
+    <w:p/>
+    <w:p>
+      <w:r>
+        <w:t xml:space="preserve">INTRODUCTION </w:t>
+      </w:r>
+    </w:p>
+    <w:p/>
+    <w:p>
+      <w:pPr>
+        <w:pStyle w:val="ListParagraph"/>
+        <w:numPr>
+          <w:ilvl w:val="0"/>
+          <w:numId w:val="17"/>
+        </w:numPr>
+      </w:pPr>
+      <w:hyperlink r:id="rId8" w:history="1">
+        <w:r>
+          <w:rPr>
+            <w:rStyle w:val="Hyperlink"/>
+          </w:rPr>
+          <w:t>https://link.springer.com/article/10.1007/s10551-022-05060-x</w:t>
+        </w:r>
+      </w:hyperlink>
+    </w:p>
+    <w:p/>
+    <w:p>
+      <w:r>
+        <w:t xml:space="preserve">Artificial Intelligence (AI), i.e., computing machines designed to mimic multiple human intelligences such as the capabilities to do, think, and feel that </w:t>
+      </w:r>
+      <w:proofErr w:type="gramStart"/>
+      <w:r>
+        <w:t>are able to</w:t>
+      </w:r>
+      <w:proofErr w:type="gramEnd"/>
+      <w:r>
+        <w:t xml:space="preserve"> interpret external data, learn from such data, and use those learnings to achieve specific goals and tasks through flexible adaptation</w:t>
+      </w:r>
+      <w:r>
+        <w:t>.</w:t>
+      </w:r>
+    </w:p>
+    <w:p>
+      <w:r>
+        <w:t xml:space="preserve">Such amplification can go in positive as well as negative directions. On the positive side, AI helps companies to spot unethical </w:t>
+      </w:r>
+      <w:proofErr w:type="spellStart"/>
+      <w:r>
+        <w:t>behavior</w:t>
+      </w:r>
+      <w:proofErr w:type="spellEnd"/>
+      <w:r>
+        <w:t xml:space="preserve"> that previously might have been unnoticed.</w:t>
+      </w:r>
+      <w:r>
+        <w:t xml:space="preserve"> On the negative side, AI can raise</w:t>
+      </w:r>
+      <w:r>
+        <w:t xml:space="preserve"> ethical concerns and alters company-employee relationships.</w:t>
+      </w:r>
+    </w:p>
+    <w:p/>
+    <w:p>
+      <w:pPr>
+        <w:pStyle w:val="ListParagraph"/>
+        <w:numPr>
+          <w:ilvl w:val="0"/>
+          <w:numId w:val="17"/>
+        </w:numPr>
+      </w:pPr>
+      <w:hyperlink r:id="rId9" w:history="1">
+        <w:r>
+          <w:rPr>
+            <w:rStyle w:val="Hyperlink"/>
+          </w:rPr>
+          <w:t>https://www.academia.edu/download/123707107/1776.pdf</w:t>
+        </w:r>
+      </w:hyperlink>
+      <w:r>
+        <w:t xml:space="preserve"> </w:t>
+      </w:r>
+      <w:hyperlink r:id="rId10" w:history="1">
+        <w:r>
+          <w:rPr>
+            <w:rStyle w:val="Hyperlink"/>
+          </w:rPr>
+          <w:t>https://d1wqtxts1xzle7.cloudfront.net/123707107/1776-libre.pdf?1752175572=&amp;response-content-disposition=inline%3B+filename%3DRise_of_Artificial_Intelligence_in_Busin.pdf&amp;Expires=1789729417&amp;Signature=aXbSWl7zsu8Ghrag5Z65nxIIkkGd~5o~NB7a3q94DfZIasd59Sg6BoFXuEOit4x7gZh~p2zZFEDCKiWJssLj9Pr6ULmV8vIhDAZM3xf9ORiccxAbOayB1oKidODMRgOkRul8Dbr8tGMAlNTsV~u~FdAf8yhJGfHoH3l7OWfc~c9Dzp9814~XQN77WQJQTrpanAETQDVbmejiNztvVRfFtk5wPV5mUizm-x2cd6sv~azmmjxSf6GJT8uiaMBlqUDmUGyqttGC4Tth3Sk3XcYOH6qKnmuJco5hhoz4qbcjJHeWNv3jDa87fG7AfvLDuG5ZhLlhvlJPXumUtCRspOrFJQ__&amp;Key-Pair-Id=APKAJLOHF5GGSLRBV4ZA</w:t>
+        </w:r>
+      </w:hyperlink>
+    </w:p>
+    <w:p/>
+    <w:p>
+      <w:r>
+        <w:t xml:space="preserve">[1] </w:t>
+      </w:r>
+      <w:r>
+        <w:t xml:space="preserve">J. P. </w:t>
+      </w:r>
+      <w:proofErr w:type="spellStart"/>
+      <w:r>
+        <w:t>Bharadiya</w:t>
+      </w:r>
+      <w:proofErr w:type="spellEnd"/>
+      <w:r>
+        <w:t xml:space="preserve">, R. K. Thomas, F. Ahmed, University of the Cumberlands, Swiss School of Business and Management, and Mid Sweden University, “Rise of artificial intelligence in business and industry,” </w:t>
+      </w:r>
+      <w:r>
+        <w:rPr>
+          <w:i/>
+          <w:iCs/>
+        </w:rPr>
+        <w:t>Journal of Engineering Research and Reports</w:t>
+      </w:r>
+      <w:r>
+        <w:t xml:space="preserve">, vol. 25, no. 3, pp. 85–103, 2023, </w:t>
+      </w:r>
+      <w:proofErr w:type="spellStart"/>
+      <w:r>
+        <w:t>doi</w:t>
+      </w:r>
+      <w:proofErr w:type="spellEnd"/>
+      <w:r>
+        <w:t>: 10.9734/JERR/2023/v25i3893.</w:t>
+      </w:r>
+    </w:p>
+    <w:p/>
+    <w:p>
+      <w:r>
+        <w:lastRenderedPageBreak/>
+        <w:t xml:space="preserve">Artificial intelligence (AI) is causing a revolution in business as well as the economy and society </w:t>
+      </w:r>
+      <w:proofErr w:type="gramStart"/>
+      <w:r>
+        <w:t>as a whole by</w:t>
+      </w:r>
+      <w:proofErr w:type="gramEnd"/>
+      <w:r>
+        <w:t xml:space="preserve"> changing the interactions and relationships that exist between stakeholders and individuals</w:t>
+      </w:r>
+    </w:p>
+    <w:p/>
+    <w:p>
+      <w:r>
+        <w:br w:type="page"/>
+      </w:r>
+    </w:p>
+    <w:p>
+      <w:proofErr w:type="gramStart"/>
+      <w:r>
+        <w:lastRenderedPageBreak/>
+        <w:t xml:space="preserve">FINDINGS </w:t>
+      </w:r>
+      <w:r>
+        <w:t xml:space="preserve"> ~</w:t>
+      </w:r>
+      <w:proofErr w:type="gramEnd"/>
+      <w:r>
+        <w:t xml:space="preserve"> </w:t>
+      </w:r>
+      <w:r>
+        <w:t>1,800-2,500 words</w:t>
       </w:r>
     </w:p>
     <w:p/>
@@ -583,7 +1214,7 @@
           <w:numId w:val="4"/>
         </w:numPr>
       </w:pPr>
-      <w:hyperlink r:id="rId8" w:history="1">
+      <w:hyperlink r:id="rId11" w:history="1">
         <w:r>
           <w:rPr>
             <w:rStyle w:val="Hyperlink"/>
@@ -631,7 +1262,7 @@
           <w:numId w:val="4"/>
         </w:numPr>
       </w:pPr>
-      <w:hyperlink r:id="rId9" w:history="1">
+      <w:hyperlink r:id="rId12" w:history="1">
         <w:r>
           <w:rPr>
             <w:rStyle w:val="Hyperlink"/>
@@ -644,7 +1275,7 @@
       <w:r>
         <w:t>Illia et al. [</w:t>
       </w:r>
-      <w:hyperlink r:id="rId10" w:anchor="ref-CR58" w:tooltip="Illia, L., Colleoni, E., Zyglidopoulos, S.: Ethical implications of text generation in the age of artificial intelligence. Bus. Ethics Environ. Responsib. 32, 201–210 (2023). &#10;                  https://doi.org/10.1111/beer.12479&#10;                  &#10;                " w:history="1">
+      <w:hyperlink r:id="rId13" w:anchor="ref-CR58" w:tooltip="Illia, L., Colleoni, E., Zyglidopoulos, S.: Ethical implications of text generation in the age of artificial intelligence. Bus. Ethics Environ. Responsib. 32, 201–210 (2023). &#10;                  https://doi.org/10.1111/beer.12479&#10;                  &#10;            " w:history="1">
         <w:r>
           <w:rPr>
             <w:rStyle w:val="Hyperlink"/>
@@ -664,17 +1295,44 @@
     <w:p/>
     <w:p>
       <w:r>
-        <w:t xml:space="preserve">Generative AI results have often yielded biased, racist, and often incorrect information owing to ineffectual model tuning, limited cross validation process and </w:t>
-      </w:r>
+        <w:t>Generative AI results have often yielded biased, racist, and often incorrect information owing to ineffectual model tuning, limited cross validation process and operationalisation. Therefore, owing to a lack of critical thinking and analysis skills in the corporate sector may result in both poor performance and embarrassing results.</w:t>
+      </w:r>
+    </w:p>
+    <w:p/>
+    <w:p>
       <w:r>
         <w:lastRenderedPageBreak/>
-        <w:t>operationalisation. Therefore, owing to a lack of critical thinking and analysis skills in the corporate sector may result in both poor performance and embarrassing results.</w:t>
-      </w:r>
-    </w:p>
-    <w:p/>
-    <w:p>
-      <w:r>
         <w:t>If users or customers have a right for their data to be erased from a database, such as under the rules of the GDPR, similar protections cannot be offered once a model has been trained a person’s data. There is also no option to later withdraw consent once a model has been trained. Mechanisms and best practice around the use of customer information, which could threaten autonomy, must be taken into consideration.</w:t>
+      </w:r>
+    </w:p>
+    <w:p/>
+    <w:p>
+      <w:pPr>
+        <w:pStyle w:val="ListParagraph"/>
+        <w:numPr>
+          <w:ilvl w:val="0"/>
+          <w:numId w:val="4"/>
+        </w:numPr>
+      </w:pPr>
+      <w:hyperlink r:id="rId14" w:history="1">
+        <w:r>
+          <w:rPr>
+            <w:rStyle w:val="Hyperlink"/>
+          </w:rPr>
+          <w:t>https://ir.lib.vntu.edu.ua/bitstream/handle/123456789/51674/189204.pdf?sequence=2&amp;isAllowed=y</w:t>
+        </w:r>
+      </w:hyperlink>
+    </w:p>
+    <w:p/>
+    <w:p>
+      <w:r>
+        <w:t>Social media and online platforms greatly facilitate this process, as each user can easily create and disseminate information. In the context of such a rapid spread of disinformation, the problem of identifying and refuting it becomes extremely important. Fake news, or deliberately fabricated false information, is used to mislead the audience or manipulate public opinion, which can have serious consequences for society.</w:t>
+      </w:r>
+    </w:p>
+    <w:p/>
+    <w:p>
+      <w:r>
+        <w:t>Fakes also have the potential to affect the economy. For example, false reports on the financial condition of companies can seriously affect their stock prices and investment attractiveness. Such information attacks can lead to significant financial losses not only for investors, but also for ordinary consumers who may lose their jobs due to market instability. False information on the Internet about companies can cause significant fluctuations in the market, which negatively affects economic stability</w:t>
       </w:r>
     </w:p>
     <w:p/>
@@ -695,16 +1353,33 @@
           <w:numId w:val="14"/>
         </w:numPr>
       </w:pPr>
-      <w:r>
-        <w:t>https://link.springer.com/article/10.1007/S43681-024-00443-4</w:t>
-      </w:r>
+      <w:hyperlink r:id="rId15" w:history="1">
+        <w:r>
+          <w:rPr>
+            <w:rStyle w:val="Hyperlink"/>
+          </w:rPr>
+          <w:t>https://link.springer.com/article/1</w:t>
+        </w:r>
+        <w:r>
+          <w:rPr>
+            <w:rStyle w:val="Hyperlink"/>
+          </w:rPr>
+          <w:t>0</w:t>
+        </w:r>
+        <w:r>
+          <w:rPr>
+            <w:rStyle w:val="Hyperlink"/>
+          </w:rPr>
+          <w:t>.1007/S43681-024-00443-4</w:t>
+        </w:r>
+      </w:hyperlink>
     </w:p>
     <w:p/>
     <w:p>
       <w:r>
         <w:t>Historically, data seeding has been used to influence Internet users through data propagation and search engine optimisation [</w:t>
       </w:r>
-      <w:hyperlink r:id="rId11" w:anchor="ref-CR70" w:tooltip="Gelper, S., van der Lans, R., van Bruggen, G.: Competition for attention in online social networks: Implications for seeding strategies. Manage. Sci. 67, 1026–1047 (2021)" w:history="1">
+      <w:hyperlink r:id="rId16" w:anchor="ref-CR70" w:tooltip="Gelper, S., van der Lans, R., van Bruggen, G.: Competition for attention in online social networks: Implications for seeding strategies. Manage. Sci. 67, 1026–1047 (2021)" w:history="1">
         <w:r>
           <w:rPr>
             <w:rStyle w:val="Hyperlink"/>
@@ -722,9 +1397,10 @@
     <w:p/>
     <w:p>
       <w:r>
+        <w:lastRenderedPageBreak/>
         <w:t>Further research indicated that an attacker only needs to control 0.01% of a dataset to poison it, which could be done for a cost of just US$60 [</w:t>
       </w:r>
-      <w:hyperlink r:id="rId12" w:anchor="ref-CR34" w:tooltip="Carlini, N., Jagielski, M., Choquette-Choo, C.A., Paleka, D., Pearce, W., Anderson, H., Terzis, A., Thomas, K., Tramèr, F.: Poisoning Web-Scale Training Datasets is Practical. (2023). ArXiv abs/2302.10149" w:history="1">
+      <w:hyperlink r:id="rId17" w:anchor="ref-CR34" w:tooltip="Carlini, N., Jagielski, M., Choquette-Choo, C.A., Paleka, D., Pearce, W., Anderson, H., Terzis, A., Thomas, K., Tramèr, F.: Poisoning Web-Scale Training Datasets is Practical. (2023). ArXiv abs/2302.10149" w:history="1">
         <w:r>
           <w:rPr>
             <w:rStyle w:val="Hyperlink"/>
@@ -745,13 +1421,9 @@
     <w:p/>
     <w:p>
       <w:r>
-        <w:t xml:space="preserve">LLMs are generally built with safeguards around generating contents that are harmful and misaligned with common moral and ethical standards. However, several researchers have demonstrated that using specific or augmented prompts can bypass the safety measures and trick these models into providing harmful content. Typically </w:t>
-      </w:r>
-      <w:r>
-        <w:lastRenderedPageBreak/>
-        <w:t>referred to as “jailbreaking,” there are numerous online resources that provide instruction to users on developing prompts that will bypass the controls of the AI engine [</w:t>
-      </w:r>
-      <w:hyperlink r:id="rId13" w:anchor="ref-CR76" w:tooltip="Boxleitner, A.: Pushing Boundaries or Crossing Lines? The Complex Ethics of ChatGPT Jailbreaking. The Complex Ethics of ChatGPT JailbreakingOctober 17, (2023) (2023)" w:history="1">
+        <w:t>LLMs are generally built with safeguards around generating contents that are harmful and misaligned with common moral and ethical standards. However, several researchers have demonstrated that using specific or augmented prompts can bypass the safety measures and trick these models into providing harmful content. Typically referred to as “jailbreaking,” there are numerous online resources that provide instruction to users on developing prompts that will bypass the controls of the AI engine [</w:t>
+      </w:r>
+      <w:hyperlink r:id="rId18" w:anchor="ref-CR76" w:tooltip="Boxleitner, A.: Pushing Boundaries or Crossing Lines? The Complex Ethics of ChatGPT Jailbreaking. The Complex Ethics of ChatGPT JailbreakingOctober 17, (2023) (2023)" w:history="1">
         <w:r>
           <w:rPr>
             <w:rStyle w:val="Hyperlink"/>
@@ -772,7 +1444,7 @@
           <w:numId w:val="14"/>
         </w:numPr>
       </w:pPr>
-      <w:hyperlink r:id="rId14" w:history="1">
+      <w:hyperlink r:id="rId19" w:history="1">
         <w:r>
           <w:rPr>
             <w:rStyle w:val="Hyperlink"/>
@@ -791,7 +1463,7 @@
       <w:r>
         <w:t>Another emblematic case is Tay, Microsoft's AI-enabled chatbot (see </w:t>
       </w:r>
-      <w:hyperlink r:id="rId15" w:anchor="F5" w:history="1">
+      <w:hyperlink r:id="rId20" w:anchor="F5" w:history="1">
         <w:r>
           <w:rPr>
             <w:rStyle w:val="Hyperlink"/>
@@ -824,7 +1496,11 @@
     <w:p/>
     <w:p>
       <w:r>
-        <w:t>However, they are not the only domains where privacy is relevant. Algorithmic HR decision-making requires employee monitoring, often without their knowledge (Leicht-Deobald et al., 2019). Furthermore, companies that use algorithmic pricing, such as insurers, ridesharing, or airlines, require access to personal data (Seele et al., 2019), which could lead to discrimination</w:t>
+        <w:t xml:space="preserve">However, they are not the only domains where privacy is relevant. Algorithmic HR decision-making requires employee monitoring, often without their knowledge (Leicht-Deobald et al., 2019). Furthermore, companies that use algorithmic pricing, such as </w:t>
+      </w:r>
+      <w:r>
+        <w:lastRenderedPageBreak/>
+        <w:t>insurers, ridesharing, or airlines, require access to personal data (Seele et al., 2019), which could lead to discrimination</w:t>
       </w:r>
     </w:p>
     <w:p/>
@@ -851,13 +1527,9 @@
       </w:r>
       <w:proofErr w:type="gramEnd"/>
       <w:r>
-        <w:t xml:space="preserve"> the right to privacy over data. In using and training models with data taken from users, </w:t>
-      </w:r>
-      <w:r>
-        <w:lastRenderedPageBreak/>
-        <w:t>for example, there must be a consideration for the protection of this data. The susceptibility of models to attacks can include the threat of information or data theft [</w:t>
-      </w:r>
-      <w:hyperlink r:id="rId16" w:anchor="ref-CR6" w:tooltip="Greshake, K., Abdelnabi, S., Mishra, S., Endres, C., Holz, T., Fritz, M.: More than you’ve asked for: A Comprehensive Analysis of Novel Prompt Injection Threats to Application-Integrated Large Language Models. arXiv preprint arXiv:2302.12173 (2023)" w:history="1">
+        <w:t xml:space="preserve"> the right to privacy over data. In using and training models with data taken from users, for example, there must be a consideration for the protection of this data. The susceptibility of models to attacks can include the threat of information or data theft [</w:t>
+      </w:r>
+      <w:hyperlink r:id="rId21" w:anchor="ref-CR6" w:tooltip="Greshake, K., Abdelnabi, S., Mishra, S., Endres, C., Holz, T., Fritz, M.: More than you’ve asked for: A Comprehensive Analysis of Novel Prompt Injection Threats to Application-Integrated Large Language Models. arXiv preprint arXiv:2302.12173 (2023)" w:history="1">
         <w:r>
           <w:rPr>
             <w:rStyle w:val="Hyperlink"/>
@@ -870,7 +1542,43 @@
       </w:r>
     </w:p>
     <w:p/>
-    <w:p/>
+    <w:p>
+      <w:pPr>
+        <w:pStyle w:val="ListParagraph"/>
+        <w:numPr>
+          <w:ilvl w:val="0"/>
+          <w:numId w:val="14"/>
+        </w:numPr>
+      </w:pPr>
+      <w:hyperlink r:id="rId22" w:history="1">
+        <w:r>
+          <w:rPr>
+            <w:rStyle w:val="Hyperlink"/>
+          </w:rPr>
+          <w:t>https://ir.lib.vntu.edu.ua/bitstream/handle/123456789/51674/189204.pdf?sequence=2&amp;isAllowed=y</w:t>
+        </w:r>
+      </w:hyperlink>
+    </w:p>
+    <w:p/>
+    <w:p>
+      <w:r>
+        <w:t>In today’s world, the flow of information is constantly growing, and with it the number of unverified claims and myths. Social media and online platforms greatly facilitate this process, as each user can easily create and disseminate information. In the context of such a rapid spread of disinformation, the problem of identifying and refuting it becomes extremely important. Fake news, or deliberately fabricated false information, is used to mislead the audience or manipulate public opinion, which can have serious consequences for society</w:t>
+      </w:r>
+    </w:p>
+    <w:p/>
+    <w:p>
+      <w:r>
+        <w:t xml:space="preserve">Studies show that fake news spreads faster and more widely than the truth due to the structure of social media, which rewards users for frequent sharing of information, regardless of its accuracy [1]. Fake news has a significant impact on society, causing </w:t>
+      </w:r>
+      <w:proofErr w:type="gramStart"/>
+      <w:r>
+        <w:t>a number of</w:t>
+      </w:r>
+      <w:proofErr w:type="gramEnd"/>
+      <w:r>
+        <w:t xml:space="preserve"> social, political, and economic consequences</w:t>
+      </w:r>
+    </w:p>
     <w:p/>
     <w:p>
       <w:r>
@@ -892,7 +1600,7 @@
           <w:lang w:val="en-US"/>
         </w:rPr>
       </w:pPr>
-      <w:hyperlink r:id="rId17" w:history="1">
+      <w:hyperlink r:id="rId23" w:history="1">
         <w:r>
           <w:rPr>
             <w:rStyle w:val="Hyperlink"/>
@@ -921,7 +1629,7 @@
       <w:r>
         <w:t xml:space="preserve"> cited as a potential risk. This includes the risk of data breaches or unauthorised access to user conversations as well as the risk of staff putting sensitive information into the program [</w:t>
       </w:r>
-      <w:hyperlink r:id="rId18" w:anchor="ref-CR56" w:tooltip="Gupta, M., Akiri, C., Aryal, K., Parker, E., Praharaj, L.: From ChatGPT to ThreatGPT: Impact of generative AI in cybersecurity and privacy. IEEE Access. (2023)" w:history="1">
+      <w:hyperlink r:id="rId24" w:anchor="ref-CR56" w:tooltip="Gupta, M., Akiri, C., Aryal, K., Parker, E., Praharaj, L.: From ChatGPT to ThreatGPT: Impact of generative AI in cybersecurity and privacy. IEEE Access. (2023)" w:history="1">
         <w:r>
           <w:rPr>
             <w:rStyle w:val="Hyperlink"/>
@@ -943,7 +1651,7 @@
       <w:r>
         <w:t>While AI presents certain risks as we will outline in the following sections, it also opens beneficial opportunities for business such as the potential to increase productivity and reduce workloads on staff [</w:t>
       </w:r>
-      <w:hyperlink r:id="rId19" w:anchor="ref-CR5" w:tooltip="Brynjolfsson, E., Li, D., Raymond, L.: Generative AI at Work. National Bureau of Economic Research (2023)" w:history="1">
+      <w:hyperlink r:id="rId25" w:anchor="ref-CR5" w:tooltip="Brynjolfsson, E., Li, D., Raymond, L.: Generative AI at Work. National Bureau of Economic Research (2023)" w:history="1">
         <w:r>
           <w:rPr>
             <w:rStyle w:val="Hyperlink"/>
@@ -966,7 +1674,7 @@
       <w:r>
         <w:t> As an ever-increasing amount of data is gathered and stored about us, there is also an increasing obligation for companies to keep that information secure. The spate of large-scale hacks where private and sensitive information has been leaked has sparked calls for greater responsibility to be taken by companies who handle and store such data [</w:t>
       </w:r>
-      <w:hyperlink r:id="rId20" w:anchor="ref-CR66" w:tooltip="Spinello, R.A.: Corporate Data breaches: A Moral and Legal Analysis. J. Inform. Ethics. 30, 12–32 (2021). &#10;                  https://doi.org/https://doi.org/&#10;                  &#10;                &#10;                  https://doi.org/10.2307/JIE.30.1.12&#10;                  &#10;                " w:history="1">
+      <w:hyperlink r:id="rId26" w:anchor="ref-CR66" w:tooltip="Spinello, R.A.: Corporate Data breaches: A Moral and Legal Analysis. J. Inform. Ethics. 30, 12–32 (2021). &#10;                  https://doi.org/https://doi.org/&#10;                  &#10;                &#10;                  https://doi.org/10.2307/JIE.30.1.12&#10;            " w:history="1">
         <w:r>
           <w:rPr>
             <w:rStyle w:val="Hyperlink"/>
@@ -993,26 +1701,21 @@
     <w:p/>
     <w:p>
       <w:r>
+        <w:lastRenderedPageBreak/>
         <w:t>Whereas policy and regulatory controls are often lacking with these new technologies, their adoption without due consideration places organisations at risk. This exacerbates the potential risk with the rapid implementation of AI in workplaces, without sufficient thought or oversight.</w:t>
       </w:r>
     </w:p>
     <w:p/>
     <w:p>
       <w:r>
-        <w:t>(</w:t>
-      </w:r>
-      <w:r>
-        <w:t>Training data extraction</w:t>
-      </w:r>
-      <w:r>
-        <w:t>)</w:t>
+        <w:t>(Training data extraction)</w:t>
       </w:r>
     </w:p>
     <w:p>
       <w:r>
         <w:t>Early test attacks on GTP-2 showed that it was possible for adversaries to extract specific examples of training data just by querying large language models [</w:t>
       </w:r>
-      <w:hyperlink r:id="rId21" w:anchor="ref-CR3" w:tooltip="Carlini, N., Tramèr, F., Wallace, E., Jagielski, M., Herbert-Voss, A., Lee, K., Roberts, A., Brown, T.B., Song, D.X., Erlingsson, Ú., Oprea, A., Raffel, C.: Extracting Training Data from Large Language Models. In: USENIX Security Symposium. (2020)" w:history="1">
+      <w:hyperlink r:id="rId27" w:anchor="ref-CR3" w:tooltip="Carlini, N., Tramèr, F., Wallace, E., Jagielski, M., Herbert-Voss, A., Lee, K., Roberts, A., Brown, T.B., Song, D.X., Erlingsson, Ú., Oprea, A., Raffel, C.: Extracting Training Data from Large Language Models. In: USENIX Security Symposium. (2020)" w:history="1">
         <w:r>
           <w:rPr>
             <w:rStyle w:val="Hyperlink"/>
@@ -1023,7 +1726,7 @@
       <w:r>
         <w:t>]. The test showed the possibility of extracting exact words and phrases used in the training of the model, alarmingly this included public personally identifiable information such as names, phone numbers and email addresses [</w:t>
       </w:r>
-      <w:hyperlink r:id="rId22" w:anchor="ref-CR3" w:tooltip="Carlini, N., Tramèr, F., Wallace, E., Jagielski, M., Herbert-Voss, A., Lee, K., Roberts, A., Brown, T.B., Song, D.X., Erlingsson, Ú., Oprea, A., Raffel, C.: Extracting Training Data from Large Language Models. In: USENIX Security Symposium. (2020)" w:history="1">
+      <w:hyperlink r:id="rId28" w:anchor="ref-CR3" w:tooltip="Carlini, N., Tramèr, F., Wallace, E., Jagielski, M., Herbert-Voss, A., Lee, K., Roberts, A., Brown, T.B., Song, D.X., Erlingsson, Ú., Oprea, A., Raffel, C.: Extracting Training Data from Large Language Models. In: USENIX Security Symposium. (2020)" w:history="1">
         <w:r>
           <w:rPr>
             <w:rStyle w:val="Hyperlink"/>
@@ -1034,7 +1737,7 @@
       <w:r>
         <w:t>]. This information only needed to appear once in the training data. In February 2023, a Harvard University student used a ‘prompt injection’ attack on Bing chat to gain access to a document otherwise hidden to users [</w:t>
       </w:r>
-      <w:hyperlink r:id="rId23" w:anchor="ref-CR75" w:tooltip="Edwards, B.: AI-powered Bing Chat spills its secrets via prompt injection attack (2023). &#10;                  https://arstechnica.com/information-technology/2023/02/ai-powered-bing-chat-spills-its-secrets-via-prompt-injection-attack/&#10;                  &#10;                . Accessed 27 November 2023" w:history="1">
+      <w:hyperlink r:id="rId29" w:anchor="ref-CR75" w:tooltip="Edwards, B.: AI-powered Bing Chat spills its secrets via prompt injection attack (2023). &#10;                  https://arstechnica.com/information-technology/2023/02/ai-powered-bing-chat-spills-its-secrets-via-prompt-injection-attack/&#10;                  &#10;         " w:history="1">
         <w:r>
           <w:rPr>
             <w:rStyle w:val="Hyperlink"/>
@@ -1062,7 +1765,7 @@
       <w:r>
         <w:t>he second factor we identify is what we term as over-trust in generative AI systems. This refers to the degree to which users trust a model with sensitive information, or trust that it is safe and secure. Studies have found that a proportion of employees have pasted sensitive information into ChatGPT [</w:t>
       </w:r>
-      <w:hyperlink r:id="rId24" w:anchor="ref-CR87" w:tooltip="Cameron, C.: 11% of data employees paste into ChatGPT is confidential (2023). &#10;                  https://www.cyberhaven.com/blog/4-2-of-workers-have-pasted-company-data-into-chatgpt&#10;                  &#10;                . Accessed 23 November 2023" w:history="1">
+      <w:hyperlink r:id="rId30" w:anchor="ref-CR87" w:tooltip="Cameron, C.: 11% of data employees paste into ChatGPT is confidential (2023). &#10;                  https://www.cyberhaven.com/blog/4-2-of-workers-have-pasted-company-data-into-chatgpt&#10;                  &#10;                . Accessed 23 November 2023" w:history="1">
         <w:r>
           <w:rPr>
             <w:rStyle w:val="Hyperlink"/>
@@ -1077,7 +1780,6 @@
     <w:p/>
     <w:p>
       <w:r>
-        <w:lastRenderedPageBreak/>
         <w:t xml:space="preserve">Some companies have moved to create their own in-house AI models trained on company data and information to assist staff with queries. </w:t>
       </w:r>
       <w:proofErr w:type="spellStart"/>
@@ -1105,7 +1807,7 @@
       <w:r>
         <w:t>In terms of beneficence, there are many positive benefits for the training of generative AI and large language models on proprietary content or knowledge [</w:t>
       </w:r>
-      <w:hyperlink r:id="rId25" w:anchor="ref-CR89" w:tooltip="Davenport, T., Alavi, M.: How to Train Generative AI Using Your Company’s Data (2023). &#10;                  https://hbr.org/2023/07/how-to-train-generative-ai-using-your-companys-data&#10;                  &#10;                . Accessed 27 November 2023" w:history="1">
+      <w:hyperlink r:id="rId31" w:anchor="ref-CR89" w:tooltip="Davenport, T., Alavi, M.: How to Train Generative AI Using Your Company’s Data (2023). &#10;                  https://hbr.org/2023/07/how-to-train-generative-ai-using-your-companys-data&#10;                  &#10;                . Accessed 27 November 2023" w:history="1">
         <w:r>
           <w:rPr>
             <w:rStyle w:val="Hyperlink"/>
@@ -1116,7 +1818,7 @@
       <w:r>
         <w:t>]. This can be useful in assisting customer-facing employees find information about company policy, solving customer problems, or keeping employee knowledge when they leave the organisation [</w:t>
       </w:r>
-      <w:hyperlink r:id="rId26" w:anchor="ref-CR89" w:tooltip="Davenport, T., Alavi, M.: How to Train Generative AI Using Your Company’s Data (2023). &#10;                  https://hbr.org/2023/07/how-to-train-generative-ai-using-your-companys-data&#10;                  &#10;                . Accessed 27 November 2023" w:history="1">
+      <w:hyperlink r:id="rId32" w:anchor="ref-CR89" w:tooltip="Davenport, T., Alavi, M.: How to Train Generative AI Using Your Company’s Data (2023). &#10;                  https://hbr.org/2023/07/how-to-train-generative-ai-using-your-companys-data&#10;                  &#10;                . Accessed 27 November 2023" w:history="1">
         <w:r>
           <w:rPr>
             <w:rStyle w:val="Hyperlink"/>
@@ -1168,7 +1870,7 @@
           <w:numId w:val="7"/>
         </w:numPr>
       </w:pPr>
-      <w:hyperlink r:id="rId27" w:history="1">
+      <w:hyperlink r:id="rId33" w:history="1">
         <w:r>
           <w:rPr>
             <w:rStyle w:val="Hyperlink"/>
@@ -1182,7 +1884,7 @@
       <w:r>
         <w:t>Instead of combining critical thinking and their own insights into a problem along with an AI model, people frequently over-rely on the AI even if they would have made a better choice on their own [</w:t>
       </w:r>
-      <w:hyperlink r:id="rId28" w:anchor="ref-CR77" w:tooltip="Buçinca, Z., B Malaya, M., Z Gajos, K.: To trust or to think: Cognitive forcing functions can reduce overreliance on AI in AI-assisted decision-making. Proc. ACM Hum. -Comput Interact. 5, Article188 (2021). &#10;                  https://doi.org/10.1145/3449287&#10;                  &#10;                " w:history="1">
+      <w:hyperlink r:id="rId34" w:anchor="ref-CR77" w:tooltip="Buçinca, Z., B Malaya, M., Z Gajos, K.: To trust or to think: Cognitive forcing functions can reduce overreliance on AI in AI-assisted decision-making. Proc. ACM Hum. -Comput Interact. 5, Article188 (2021). &#10;                  https://doi.org/10.1145/3449287&#10;  " w:history="1">
         <w:r>
           <w:rPr>
             <w:rStyle w:val="Hyperlink"/>
@@ -1197,11 +1899,7 @@
     <w:p/>
     <w:p>
       <w:r>
-        <w:t xml:space="preserve">In line with the principle of beneficence, ethical implementation of generative AI in business should be of benefit to employees, promote well-being and make the workplace better overall. Guardrails should be in place to ensure that its </w:t>
-      </w:r>
-      <w:r>
-        <w:lastRenderedPageBreak/>
-        <w:t>implementation is not providing more avenues for employees to make mistakes, which could potentially lead to cyber security risks.</w:t>
+        <w:t>In line with the principle of beneficence, ethical implementation of generative AI in business should be of benefit to employees, promote well-being and make the workplace better overall. Guardrails should be in place to ensure that its implementation is not providing more avenues for employees to make mistakes, which could potentially lead to cyber security risks.</w:t>
       </w:r>
     </w:p>
     <w:p/>
@@ -1209,7 +1907,7 @@
       <w:r>
         <w:t>For example, over-relying on generative AI in coding can serve as a more immediate cyber security threat, as past versions of GitHub’s Copilot were found to recommend insecure and vulnerable code to developers [</w:t>
       </w:r>
-      <w:hyperlink r:id="rId29" w:anchor="ref-CR81" w:tooltip="Pearce, H., Ahmad, B., Tan, B., Dolan-Gavitt, B., Karri, R.: Asleep at the keyboard? assessing the security of github copilot’s code contributions. In: 2022 IEEE Symposium on Security and Privacy (SP), pp. 754–768. IEEE, (2022)" w:history="1">
+      <w:hyperlink r:id="rId35" w:anchor="ref-CR81" w:tooltip="Pearce, H., Ahmad, B., Tan, B., Dolan-Gavitt, B., Karri, R.: Asleep at the keyboard? assessing the security of github copilot’s code contributions. In: 2022 IEEE Symposium on Security and Privacy (SP), pp. 754–768. IEEE, (2022)" w:history="1">
         <w:r>
           <w:rPr>
             <w:rStyle w:val="Hyperlink"/>
@@ -1224,6 +1922,7 @@
     <w:p/>
     <w:p>
       <w:r>
+        <w:lastRenderedPageBreak/>
         <w:t xml:space="preserve">When implementing a generative AI system, its use and capabilities should be explainable to all users. Management and employees should know why certain systems are used, how they make their decisions and on what information </w:t>
       </w:r>
       <w:proofErr w:type="gramStart"/>
@@ -1236,6 +1935,63 @@
       </w:r>
     </w:p>
     <w:p/>
+    <w:p>
+      <w:pPr>
+        <w:pStyle w:val="ListParagraph"/>
+        <w:numPr>
+          <w:ilvl w:val="0"/>
+          <w:numId w:val="7"/>
+        </w:numPr>
+      </w:pPr>
+      <w:hyperlink r:id="rId36" w:history="1">
+        <w:r>
+          <w:rPr>
+            <w:rStyle w:val="Hyperlink"/>
+          </w:rPr>
+          <w:t>https://click.endnote.com/viewer?doi=10.48550%2Farxiv.2502.01635&amp;token=WzQzOTExMTUsIjEwLjQ4NTUwL2FyeGl2LjI1MDIuMDE2MzUiXQ.zaW9DuwuC6Ft0-S5uvVre-zeqSY</w:t>
+        </w:r>
+      </w:hyperlink>
+    </w:p>
+    <w:p>
+      <w:hyperlink r:id="rId37" w:history="1">
+        <w:r>
+          <w:rPr>
+            <w:rStyle w:val="Hyperlink"/>
+          </w:rPr>
+          <w:t>https://arxiv.org/abs/2502.01635</w:t>
+        </w:r>
+      </w:hyperlink>
+    </w:p>
+    <w:p/>
+    <w:p>
+      <w:r>
+        <w:t xml:space="preserve">Additionally, as agentic AI systems undertake more </w:t>
+      </w:r>
+      <w:proofErr w:type="spellStart"/>
+      <w:r>
+        <w:t>complexand</w:t>
+      </w:r>
+      <w:proofErr w:type="spellEnd"/>
+      <w:r>
+        <w:t xml:space="preserve"> long-horizon tasks, with limited human oversight, </w:t>
+      </w:r>
+      <w:proofErr w:type="spellStart"/>
+      <w:r>
+        <w:t>usersare</w:t>
+      </w:r>
+      <w:proofErr w:type="spellEnd"/>
+      <w:r>
+        <w:t xml:space="preserve"> likely to repose greater trust in those systems, </w:t>
+      </w:r>
+      <w:proofErr w:type="spellStart"/>
+      <w:r>
+        <w:t>poten-tially</w:t>
+      </w:r>
+      <w:proofErr w:type="spellEnd"/>
+      <w:r>
+        <w:t xml:space="preserve"> developing asymmetric relationships of dependence</w:t>
+      </w:r>
+    </w:p>
     <w:p/>
     <w:p/>
     <w:p>
@@ -1255,7 +2011,7 @@
           <w:numId w:val="6"/>
         </w:numPr>
       </w:pPr>
-      <w:hyperlink r:id="rId30" w:history="1">
+      <w:hyperlink r:id="rId38" w:history="1">
         <w:r>
           <w:rPr>
             <w:rStyle w:val="Hyperlink"/>
@@ -1269,7 +2025,7 @@
       <w:r>
         <w:t>Generative AI provides a distinct ethical consideration regarding autonomy. Data scraping for training AI models takes away the autonomy of individuals to choose to have their data used, possibly infringing on privacy and intellectual property rights. One such example is an artist having their work used to train a model which can subsequently generate new simulated works matching their unique style [</w:t>
       </w:r>
-      <w:hyperlink r:id="rId31" w:anchor="ref-CR64" w:tooltip="Franceschelli, G., Musolesi, M.: Copyright in generative deep learning. Data Policy 4, e17 (2022)" w:history="1">
+      <w:hyperlink r:id="rId39" w:anchor="ref-CR64" w:tooltip="Franceschelli, G., Musolesi, M.: Copyright in generative deep learning. Data Policy 4, e17 (2022)" w:history="1">
         <w:r>
           <w:rPr>
             <w:rStyle w:val="Hyperlink"/>
@@ -1307,7 +2063,7 @@
           <w:numId w:val="6"/>
         </w:numPr>
       </w:pPr>
-      <w:hyperlink r:id="rId32" w:history="1">
+      <w:hyperlink r:id="rId40" w:history="1">
         <w:r>
           <w:rPr>
             <w:rStyle w:val="Hyperlink"/>
@@ -1358,6 +2114,7 @@
           <w:lang w:val="en-US"/>
         </w:rPr>
       </w:pPr>
+      <w:bookmarkStart w:id="5" w:name="_Toc240650089"/>
       <w:r>
         <w:rPr>
           <w:lang w:val="en-US"/>
@@ -1365,6 +2122,35 @@
         <w:lastRenderedPageBreak/>
         <w:t>Recommendation</w:t>
       </w:r>
+      <w:bookmarkEnd w:id="5"/>
+    </w:p>
+    <w:p>
+      <w:pPr>
+        <w:rPr>
+          <w:lang w:val="en-US"/>
+        </w:rPr>
+      </w:pPr>
+    </w:p>
+    <w:p>
+      <w:pPr>
+        <w:pStyle w:val="ListParagraph"/>
+        <w:numPr>
+          <w:ilvl w:val="0"/>
+          <w:numId w:val="16"/>
+        </w:numPr>
+        <w:rPr>
+          <w:lang w:val="en-US"/>
+        </w:rPr>
+      </w:pPr>
+      <w:hyperlink r:id="rId41" w:history="1">
+        <w:r>
+          <w:rPr>
+            <w:rStyle w:val="Hyperlink"/>
+            <w:lang w:val="en-US"/>
+          </w:rPr>
+          <w:t>https://link.springer.com/article/10.1007/S43681-024-00443-4</w:t>
+        </w:r>
+      </w:hyperlink>
     </w:p>
     <w:p>
       <w:pPr>
@@ -1455,11 +2241,8 @@
     </w:p>
     <w:p>
       <w:r>
-        <w:t xml:space="preserve">One of the biggest pain points for business is upskilling and training staff. When implementing a strategy with generative AI, companies should consider what benefit the AI is bringing, while also considering the human impact this will have on staff. If staff </w:t>
-      </w:r>
-      <w:r>
         <w:lastRenderedPageBreak/>
-        <w:t>are being asked to work with, train or implement models, they might be concerned that they will soon be replaced by these models. Upskilling and training will also be essential to mitigate the potential threats from overreliance and over-trust in new generative AI models.</w:t>
+        <w:t>One of the biggest pain points for business is upskilling and training staff. When implementing a strategy with generative AI, companies should consider what benefit the AI is bringing, while also considering the human impact this will have on staff. If staff are being asked to work with, train or implement models, they might be concerned that they will soon be replaced by these models. Upskilling and training will also be essential to mitigate the potential threats from overreliance and over-trust in new generative AI models.</w:t>
       </w:r>
     </w:p>
     <w:p>
@@ -1470,30 +2253,32 @@
       </w:pPr>
     </w:p>
     <w:p>
+      <w:r>
+        <w:t xml:space="preserve">The rapid adoption of generative AI seems to be moving faster than the industry’s understanding of the technology and its inherent ethical and cyber security risks. Companies will need to manage the risk from new vulnerabilities due to generative AI, requiring new forms of governance and regulatory frameworks. Employee training, procedures and managed implementation are an ethical responsibility to protect workers, sensitive company information and the public. Companies now </w:t>
+      </w:r>
+      <w:proofErr w:type="gramStart"/>
+      <w:r>
+        <w:t>have the opportunity to</w:t>
+      </w:r>
+      <w:proofErr w:type="gramEnd"/>
+      <w:r>
+        <w:t xml:space="preserve"> prevent expensive and unnecessary consequences of generative AI, by addressing the ethical and cyber security threats and investing in data protection measures.</w:t>
+      </w:r>
+    </w:p>
+    <w:p>
       <w:pPr>
         <w:rPr>
           <w:lang w:val="en-US"/>
         </w:rPr>
       </w:pPr>
-      <w:r>
-        <w:t xml:space="preserve">The rapid adoption of generative AI seems to be moving faster than the industry’s understanding of the technology and its inherent ethical and cyber security risks. Companies will need to manage the risk from new vulnerabilities due to generative AI, requiring new forms of governance and regulatory frameworks. Employee training, procedures and managed implementation are an ethical responsibility to protect workers, sensitive company information and the public. Companies now </w:t>
-      </w:r>
-      <w:proofErr w:type="gramStart"/>
-      <w:r>
-        <w:t>have the opportunity to</w:t>
-      </w:r>
-      <w:proofErr w:type="gramEnd"/>
-      <w:r>
-        <w:t xml:space="preserve"> prevent expensive and unnecessary consequences of generative AI, by addressing the ethical and cyber security threats and investing in data protection measures.</w:t>
-      </w:r>
     </w:p>
     <w:sectPr>
-      <w:headerReference w:type="even" r:id="rId33"/>
-      <w:headerReference w:type="default" r:id="rId34"/>
-      <w:footerReference w:type="even" r:id="rId35"/>
-      <w:footerReference w:type="default" r:id="rId36"/>
-      <w:headerReference w:type="first" r:id="rId37"/>
-      <w:footerReference w:type="first" r:id="rId38"/>
+      <w:headerReference w:type="even" r:id="rId42"/>
+      <w:headerReference w:type="default" r:id="rId43"/>
+      <w:footerReference w:type="even" r:id="rId44"/>
+      <w:footerReference w:type="default" r:id="rId45"/>
+      <w:headerReference w:type="first" r:id="rId46"/>
+      <w:footerReference w:type="first" r:id="rId47"/>
       <w:pgSz w:w="11906" w:h="16838"/>
       <w:pgMar w:top="1440" w:right="1440" w:bottom="1440" w:left="1440" w:header="708" w:footer="708" w:gutter="0"/>
       <w:cols w:space="708"/>
@@ -1818,6 +2603,95 @@
     </w:lvl>
   </w:abstractNum>
   <w:abstractNum w:abstractNumId="2" w15:restartNumberingAfterBreak="0">
+    <w:nsid w:val="1091429A"/>
+    <w:multiLevelType w:val="hybridMultilevel"/>
+    <w:tmpl w:val="F17A7106"/>
+    <w:lvl w:ilvl="0" w:tplc="4409000F">
+      <w:start w:val="1"/>
+      <w:numFmt w:val="decimal"/>
+      <w:lvlText w:val="%1."/>
+      <w:lvlJc w:val="left"/>
+      <w:pPr>
+        <w:ind w:left="720" w:hanging="360"/>
+      </w:pPr>
+      <w:rPr>
+        <w:rFonts w:hint="default"/>
+      </w:rPr>
+    </w:lvl>
+    <w:lvl w:ilvl="1" w:tplc="44090019" w:tentative="1">
+      <w:start w:val="1"/>
+      <w:numFmt w:val="lowerLetter"/>
+      <w:lvlText w:val="%2."/>
+      <w:lvlJc w:val="left"/>
+      <w:pPr>
+        <w:ind w:left="1440" w:hanging="360"/>
+      </w:pPr>
+    </w:lvl>
+    <w:lvl w:ilvl="2" w:tplc="4409001B" w:tentative="1">
+      <w:start w:val="1"/>
+      <w:numFmt w:val="lowerRoman"/>
+      <w:lvlText w:val="%3."/>
+      <w:lvlJc w:val="right"/>
+      <w:pPr>
+        <w:ind w:left="2160" w:hanging="180"/>
+      </w:pPr>
+    </w:lvl>
+    <w:lvl w:ilvl="3" w:tplc="4409000F" w:tentative="1">
+      <w:start w:val="1"/>
+      <w:numFmt w:val="decimal"/>
+      <w:lvlText w:val="%4."/>
+      <w:lvlJc w:val="left"/>
+      <w:pPr>
+        <w:ind w:left="2880" w:hanging="360"/>
+      </w:pPr>
+    </w:lvl>
+    <w:lvl w:ilvl="4" w:tplc="44090019" w:tentative="1">
+      <w:start w:val="1"/>
+      <w:numFmt w:val="lowerLetter"/>
+      <w:lvlText w:val="%5."/>
+      <w:lvlJc w:val="left"/>
+      <w:pPr>
+        <w:ind w:left="3600" w:hanging="360"/>
+      </w:pPr>
+    </w:lvl>
+    <w:lvl w:ilvl="5" w:tplc="4409001B" w:tentative="1">
+      <w:start w:val="1"/>
+      <w:numFmt w:val="lowerRoman"/>
+      <w:lvlText w:val="%6."/>
+      <w:lvlJc w:val="right"/>
+      <w:pPr>
+        <w:ind w:left="4320" w:hanging="180"/>
+      </w:pPr>
+    </w:lvl>
+    <w:lvl w:ilvl="6" w:tplc="4409000F" w:tentative="1">
+      <w:start w:val="1"/>
+      <w:numFmt w:val="decimal"/>
+      <w:lvlText w:val="%7."/>
+      <w:lvlJc w:val="left"/>
+      <w:pPr>
+        <w:ind w:left="5040" w:hanging="360"/>
+      </w:pPr>
+    </w:lvl>
+    <w:lvl w:ilvl="7" w:tplc="44090019" w:tentative="1">
+      <w:start w:val="1"/>
+      <w:numFmt w:val="lowerLetter"/>
+      <w:lvlText w:val="%8."/>
+      <w:lvlJc w:val="left"/>
+      <w:pPr>
+        <w:ind w:left="5760" w:hanging="360"/>
+      </w:pPr>
+    </w:lvl>
+    <w:lvl w:ilvl="8" w:tplc="4409001B" w:tentative="1">
+      <w:start w:val="1"/>
+      <w:numFmt w:val="lowerRoman"/>
+      <w:lvlText w:val="%9."/>
+      <w:lvlJc w:val="right"/>
+      <w:pPr>
+        <w:ind w:left="6480" w:hanging="180"/>
+      </w:pPr>
+    </w:lvl>
+  </w:abstractNum>
+  <w:abstractNum w:abstractNumId="3" w15:restartNumberingAfterBreak="0">
     <w:nsid w:val="12BB39CB"/>
     <w:multiLevelType w:val="multilevel"/>
     <w:tmpl w:val="E034D4EE"/>
@@ -1930,7 +2804,7 @@
       </w:pPr>
     </w:lvl>
   </w:abstractNum>
-  <w:abstractNum w:abstractNumId="3" w15:restartNumberingAfterBreak="0">
+  <w:abstractNum w:abstractNumId="4" w15:restartNumberingAfterBreak="0">
     <w:nsid w:val="19687281"/>
     <w:multiLevelType w:val="hybridMultilevel"/>
     <w:tmpl w:val="BF6C1E3A"/>
@@ -2019,7 +2893,7 @@
       </w:pPr>
     </w:lvl>
   </w:abstractNum>
-  <w:abstractNum w:abstractNumId="4" w15:restartNumberingAfterBreak="0">
+  <w:abstractNum w:abstractNumId="5" w15:restartNumberingAfterBreak="0">
     <w:nsid w:val="250269B2"/>
     <w:multiLevelType w:val="hybridMultilevel"/>
     <w:tmpl w:val="B9E876B2"/>
@@ -2108,7 +2982,7 @@
       </w:pPr>
     </w:lvl>
   </w:abstractNum>
-  <w:abstractNum w:abstractNumId="5" w15:restartNumberingAfterBreak="0">
+  <w:abstractNum w:abstractNumId="6" w15:restartNumberingAfterBreak="0">
     <w:nsid w:val="302D66D9"/>
     <w:multiLevelType w:val="hybridMultilevel"/>
     <w:tmpl w:val="CAE8DF7A"/>
@@ -2221,7 +3095,7 @@
       </w:rPr>
     </w:lvl>
   </w:abstractNum>
-  <w:abstractNum w:abstractNumId="6" w15:restartNumberingAfterBreak="0">
+  <w:abstractNum w:abstractNumId="7" w15:restartNumberingAfterBreak="0">
     <w:nsid w:val="3E520B07"/>
     <w:multiLevelType w:val="multilevel"/>
     <w:tmpl w:val="5538A052"/>
@@ -2334,7 +3208,7 @@
       </w:pPr>
     </w:lvl>
   </w:abstractNum>
-  <w:abstractNum w:abstractNumId="7" w15:restartNumberingAfterBreak="0">
+  <w:abstractNum w:abstractNumId="8" w15:restartNumberingAfterBreak="0">
     <w:nsid w:val="43096C79"/>
     <w:multiLevelType w:val="multilevel"/>
     <w:tmpl w:val="6346D42A"/>
@@ -2447,7 +3321,96 @@
       </w:pPr>
     </w:lvl>
   </w:abstractNum>
-  <w:abstractNum w:abstractNumId="8" w15:restartNumberingAfterBreak="0">
+  <w:abstractNum w:abstractNumId="9" w15:restartNumberingAfterBreak="0">
+    <w:nsid w:val="4D087D27"/>
+    <w:multiLevelType w:val="hybridMultilevel"/>
+    <w:tmpl w:val="28CEC8AA"/>
+    <w:lvl w:ilvl="0" w:tplc="4409000F">
+      <w:start w:val="1"/>
+      <w:numFmt w:val="decimal"/>
+      <w:lvlText w:val="%1."/>
+      <w:lvlJc w:val="left"/>
+      <w:pPr>
+        <w:ind w:left="720" w:hanging="360"/>
+      </w:pPr>
+      <w:rPr>
+        <w:rFonts w:hint="default"/>
+      </w:rPr>
+    </w:lvl>
+    <w:lvl w:ilvl="1" w:tplc="44090019" w:tentative="1">
+      <w:start w:val="1"/>
+      <w:numFmt w:val="lowerLetter"/>
+      <w:lvlText w:val="%2."/>
+      <w:lvlJc w:val="left"/>
+      <w:pPr>
+        <w:ind w:left="1440" w:hanging="360"/>
+      </w:pPr>
+    </w:lvl>
+    <w:lvl w:ilvl="2" w:tplc="4409001B" w:tentative="1">
+      <w:start w:val="1"/>
+      <w:numFmt w:val="lowerRoman"/>
+      <w:lvlText w:val="%3."/>
+      <w:lvlJc w:val="right"/>
+      <w:pPr>
+        <w:ind w:left="2160" w:hanging="180"/>
+      </w:pPr>
+    </w:lvl>
+    <w:lvl w:ilvl="3" w:tplc="4409000F" w:tentative="1">
+      <w:start w:val="1"/>
+      <w:numFmt w:val="decimal"/>
+      <w:lvlText w:val="%4."/>
+      <w:lvlJc w:val="left"/>
+      <w:pPr>
+        <w:ind w:left="2880" w:hanging="360"/>
+      </w:pPr>
+    </w:lvl>
+    <w:lvl w:ilvl="4" w:tplc="44090019" w:tentative="1">
+      <w:start w:val="1"/>
+      <w:numFmt w:val="lowerLetter"/>
+      <w:lvlText w:val="%5."/>
+      <w:lvlJc w:val="left"/>
+      <w:pPr>
+        <w:ind w:left="3600" w:hanging="360"/>
+      </w:pPr>
+    </w:lvl>
+    <w:lvl w:ilvl="5" w:tplc="4409001B" w:tentative="1">
+      <w:start w:val="1"/>
+      <w:numFmt w:val="lowerRoman"/>
+      <w:lvlText w:val="%6."/>
+      <w:lvlJc w:val="right"/>
+      <w:pPr>
+        <w:ind w:left="4320" w:hanging="180"/>
+      </w:pPr>
+    </w:lvl>
+    <w:lvl w:ilvl="6" w:tplc="4409000F" w:tentative="1">
+      <w:start w:val="1"/>
+      <w:numFmt w:val="decimal"/>
+      <w:lvlText w:val="%7."/>
+      <w:lvlJc w:val="left"/>
+      <w:pPr>
+        <w:ind w:left="5040" w:hanging="360"/>
+      </w:pPr>
+    </w:lvl>
+    <w:lvl w:ilvl="7" w:tplc="44090019" w:tentative="1">
+      <w:start w:val="1"/>
+      <w:numFmt w:val="lowerLetter"/>
+      <w:lvlText w:val="%8."/>
+      <w:lvlJc w:val="left"/>
+      <w:pPr>
+        <w:ind w:left="5760" w:hanging="360"/>
+      </w:pPr>
+    </w:lvl>
+    <w:lvl w:ilvl="8" w:tplc="4409001B" w:tentative="1">
+      <w:start w:val="1"/>
+      <w:numFmt w:val="lowerRoman"/>
+      <w:lvlText w:val="%9."/>
+      <w:lvlJc w:val="right"/>
+      <w:pPr>
+        <w:ind w:left="6480" w:hanging="180"/>
+      </w:pPr>
+    </w:lvl>
+  </w:abstractNum>
+  <w:abstractNum w:abstractNumId="10" w15:restartNumberingAfterBreak="0">
     <w:nsid w:val="597817B0"/>
     <w:multiLevelType w:val="hybridMultilevel"/>
     <w:tmpl w:val="01C42A9C"/>
@@ -2559,7 +3522,7 @@
       </w:rPr>
     </w:lvl>
   </w:abstractNum>
-  <w:abstractNum w:abstractNumId="9" w15:restartNumberingAfterBreak="0">
+  <w:abstractNum w:abstractNumId="11" w15:restartNumberingAfterBreak="0">
     <w:nsid w:val="645D09BE"/>
     <w:multiLevelType w:val="hybridMultilevel"/>
     <w:tmpl w:val="CCCEA7BA"/>
@@ -2648,7 +3611,96 @@
       </w:pPr>
     </w:lvl>
   </w:abstractNum>
-  <w:abstractNum w:abstractNumId="10" w15:restartNumberingAfterBreak="0">
+  <w:abstractNum w:abstractNumId="12" w15:restartNumberingAfterBreak="0">
+    <w:nsid w:val="67740BE8"/>
+    <w:multiLevelType w:val="hybridMultilevel"/>
+    <w:tmpl w:val="013E0B3A"/>
+    <w:lvl w:ilvl="0" w:tplc="4409000F">
+      <w:start w:val="1"/>
+      <w:numFmt w:val="decimal"/>
+      <w:lvlText w:val="%1."/>
+      <w:lvlJc w:val="left"/>
+      <w:pPr>
+        <w:ind w:left="720" w:hanging="360"/>
+      </w:pPr>
+      <w:rPr>
+        <w:rFonts w:hint="default"/>
+      </w:rPr>
+    </w:lvl>
+    <w:lvl w:ilvl="1" w:tplc="44090019" w:tentative="1">
+      <w:start w:val="1"/>
+      <w:numFmt w:val="lowerLetter"/>
+      <w:lvlText w:val="%2."/>
+      <w:lvlJc w:val="left"/>
+      <w:pPr>
+        <w:ind w:left="1440" w:hanging="360"/>
+      </w:pPr>
+    </w:lvl>
+    <w:lvl w:ilvl="2" w:tplc="4409001B" w:tentative="1">
+      <w:start w:val="1"/>
+      <w:numFmt w:val="lowerRoman"/>
+      <w:lvlText w:val="%3."/>
+      <w:lvlJc w:val="right"/>
+      <w:pPr>
+        <w:ind w:left="2160" w:hanging="180"/>
+      </w:pPr>
+    </w:lvl>
+    <w:lvl w:ilvl="3" w:tplc="4409000F" w:tentative="1">
+      <w:start w:val="1"/>
+      <w:numFmt w:val="decimal"/>
+      <w:lvlText w:val="%4."/>
+      <w:lvlJc w:val="left"/>
+      <w:pPr>
+        <w:ind w:left="2880" w:hanging="360"/>
+      </w:pPr>
+    </w:lvl>
+    <w:lvl w:ilvl="4" w:tplc="44090019" w:tentative="1">
+      <w:start w:val="1"/>
+      <w:numFmt w:val="lowerLetter"/>
+      <w:lvlText w:val="%5."/>
+      <w:lvlJc w:val="left"/>
+      <w:pPr>
+        <w:ind w:left="3600" w:hanging="360"/>
+      </w:pPr>
+    </w:lvl>
+    <w:lvl w:ilvl="5" w:tplc="4409001B" w:tentative="1">
+      <w:start w:val="1"/>
+      <w:numFmt w:val="lowerRoman"/>
+      <w:lvlText w:val="%6."/>
+      <w:lvlJc w:val="right"/>
+      <w:pPr>
+        <w:ind w:left="4320" w:hanging="180"/>
+      </w:pPr>
+    </w:lvl>
+    <w:lvl w:ilvl="6" w:tplc="4409000F" w:tentative="1">
+      <w:start w:val="1"/>
+      <w:numFmt w:val="decimal"/>
+      <w:lvlText w:val="%7."/>
+      <w:lvlJc w:val="left"/>
+      <w:pPr>
+        <w:ind w:left="5040" w:hanging="360"/>
+      </w:pPr>
+    </w:lvl>
+    <w:lvl w:ilvl="7" w:tplc="44090019" w:tentative="1">
+      <w:start w:val="1"/>
+      <w:numFmt w:val="lowerLetter"/>
+      <w:lvlText w:val="%8."/>
+      <w:lvlJc w:val="left"/>
+      <w:pPr>
+        <w:ind w:left="5760" w:hanging="360"/>
+      </w:pPr>
+    </w:lvl>
+    <w:lvl w:ilvl="8" w:tplc="4409001B" w:tentative="1">
+      <w:start w:val="1"/>
+      <w:numFmt w:val="lowerRoman"/>
+      <w:lvlText w:val="%9."/>
+      <w:lvlJc w:val="right"/>
+      <w:pPr>
+        <w:ind w:left="6480" w:hanging="180"/>
+      </w:pPr>
+    </w:lvl>
+  </w:abstractNum>
+  <w:abstractNum w:abstractNumId="13" w15:restartNumberingAfterBreak="0">
     <w:nsid w:val="68F24AAB"/>
     <w:multiLevelType w:val="hybridMultilevel"/>
     <w:tmpl w:val="3098B45A"/>
@@ -2737,7 +3789,7 @@
       </w:pPr>
     </w:lvl>
   </w:abstractNum>
-  <w:abstractNum w:abstractNumId="11" w15:restartNumberingAfterBreak="0">
+  <w:abstractNum w:abstractNumId="14" w15:restartNumberingAfterBreak="0">
     <w:nsid w:val="6A4A6DED"/>
     <w:multiLevelType w:val="hybridMultilevel"/>
     <w:tmpl w:val="C9DA4C30"/>
@@ -2849,7 +3901,7 @@
       </w:rPr>
     </w:lvl>
   </w:abstractNum>
-  <w:abstractNum w:abstractNumId="12" w15:restartNumberingAfterBreak="0">
+  <w:abstractNum w:abstractNumId="15" w15:restartNumberingAfterBreak="0">
     <w:nsid w:val="6B44627A"/>
     <w:multiLevelType w:val="multilevel"/>
     <w:tmpl w:val="4A18E128"/>
@@ -2962,7 +4014,7 @@
       </w:pPr>
     </w:lvl>
   </w:abstractNum>
-  <w:abstractNum w:abstractNumId="13" w15:restartNumberingAfterBreak="0">
+  <w:abstractNum w:abstractNumId="16" w15:restartNumberingAfterBreak="0">
     <w:nsid w:val="799111D3"/>
     <w:multiLevelType w:val="hybridMultilevel"/>
     <w:tmpl w:val="37B0E990"/>
@@ -3052,46 +4104,55 @@
     </w:lvl>
   </w:abstractNum>
   <w:num w:numId="1" w16cid:durableId="854225435">
-    <w:abstractNumId w:val="8"/>
+    <w:abstractNumId w:val="10"/>
   </w:num>
   <w:num w:numId="2" w16cid:durableId="1864054581">
-    <w:abstractNumId w:val="5"/>
+    <w:abstractNumId w:val="6"/>
   </w:num>
   <w:num w:numId="3" w16cid:durableId="689338242">
-    <w:abstractNumId w:val="11"/>
+    <w:abstractNumId w:val="14"/>
   </w:num>
   <w:num w:numId="4" w16cid:durableId="1549878278">
-    <w:abstractNumId w:val="3"/>
+    <w:abstractNumId w:val="4"/>
   </w:num>
   <w:num w:numId="5" w16cid:durableId="318775108">
     <w:abstractNumId w:val="1"/>
   </w:num>
   <w:num w:numId="6" w16cid:durableId="932128440">
+    <w:abstractNumId w:val="16"/>
+  </w:num>
+  <w:num w:numId="7" w16cid:durableId="1356150948">
     <w:abstractNumId w:val="13"/>
   </w:num>
-  <w:num w:numId="7" w16cid:durableId="1356150948">
-    <w:abstractNumId w:val="10"/>
-  </w:num>
   <w:num w:numId="8" w16cid:durableId="52971523">
-    <w:abstractNumId w:val="6"/>
+    <w:abstractNumId w:val="7"/>
   </w:num>
   <w:num w:numId="9" w16cid:durableId="903370659">
-    <w:abstractNumId w:val="12"/>
+    <w:abstractNumId w:val="15"/>
   </w:num>
   <w:num w:numId="10" w16cid:durableId="2114667754">
-    <w:abstractNumId w:val="7"/>
+    <w:abstractNumId w:val="8"/>
   </w:num>
   <w:num w:numId="11" w16cid:durableId="1308970869">
     <w:abstractNumId w:val="0"/>
   </w:num>
   <w:num w:numId="12" w16cid:durableId="447159889">
+    <w:abstractNumId w:val="3"/>
+  </w:num>
+  <w:num w:numId="13" w16cid:durableId="1870415028">
+    <w:abstractNumId w:val="11"/>
+  </w:num>
+  <w:num w:numId="14" w16cid:durableId="369453745">
+    <w:abstractNumId w:val="5"/>
+  </w:num>
+  <w:num w:numId="15" w16cid:durableId="560554908">
+    <w:abstractNumId w:val="9"/>
+  </w:num>
+  <w:num w:numId="16" w16cid:durableId="1732120032">
     <w:abstractNumId w:val="2"/>
   </w:num>
-  <w:num w:numId="13" w16cid:durableId="1870415028">
-    <w:abstractNumId w:val="9"/>
-  </w:num>
-  <w:num w:numId="14" w16cid:durableId="369453745">
-    <w:abstractNumId w:val="4"/>
+  <w:num w:numId="17" w16cid:durableId="27223933">
+    <w:abstractNumId w:val="12"/>
   </w:num>
 </w:numbering>
 </file>
@@ -4112,6 +5173,18 @@
     <w:uiPriority w:val="99"/>
     <w:rsid w:val="00BA0D5E"/>
   </w:style>
+  <w:style w:type="character" w:styleId="FollowedHyperlink">
+    <w:name w:val="FollowedHyperlink"/>
+    <w:basedOn w:val="DefaultParagraphFont"/>
+    <w:uiPriority w:val="99"/>
+    <w:semiHidden/>
+    <w:unhideWhenUsed/>
+    <w:rsid w:val="00A45ED9"/>
+    <w:rPr>
+      <w:color w:val="96607D" w:themeColor="followedHyperlink"/>
+      <w:u w:val="single"/>
+    </w:rPr>
+  </w:style>
 </w:styles>
 </file>
 

</xml_diff>

<commit_message>
CREATED INTRODUCTION N CONTINUED FINDINGS
</commit_message>
<xml_diff>
--- a/DRAFT REPORT.docx
+++ b/DRAFT REPORT.docx
@@ -615,6 +615,23 @@
     <w:p/>
     <w:p>
       <w:r>
+        <w:rPr>
+          <w:highlight w:val="red"/>
+        </w:rPr>
+        <w:t>ADD GRAPHS / CHARTS</w:t>
+      </w:r>
+      <w:r>
+        <w:t xml:space="preserve"> </w:t>
+      </w:r>
+      <w:proofErr w:type="spellStart"/>
+      <w:r>
+        <w:t>importante</w:t>
+      </w:r>
+      <w:proofErr w:type="spellEnd"/>
+    </w:p>
+    <w:p/>
+    <w:p>
+      <w:r>
         <w:t>Key issues</w:t>
       </w:r>
       <w:r>
@@ -632,6 +649,12 @@
       <w:r>
         <w:t xml:space="preserve">public distrust in business using ai </w:t>
       </w:r>
+      <w:r>
+        <w:rPr>
+          <w:highlight w:val="yellow"/>
+        </w:rPr>
+        <w:t>(Public Trust, Transparency and Accountability)</w:t>
+      </w:r>
     </w:p>
     <w:p>
       <w:pPr>
@@ -644,6 +667,15 @@
       <w:r>
         <w:t>employee data leak/sensitive data shared to ai?</w:t>
       </w:r>
+      <w:r>
+        <w:t xml:space="preserve"> </w:t>
+      </w:r>
+      <w:r>
+        <w:rPr>
+          <w:highlight w:val="yellow"/>
+        </w:rPr>
+        <w:t>(Employee Privacy and Sensitive Data)</w:t>
+      </w:r>
     </w:p>
     <w:p>
       <w:pPr>
@@ -656,6 +688,15 @@
       <w:r>
         <w:t>Data training (without consent)?</w:t>
       </w:r>
+      <w:r>
+        <w:t xml:space="preserve"> </w:t>
+      </w:r>
+      <w:r>
+        <w:rPr>
+          <w:highlight w:val="yellow"/>
+        </w:rPr>
+        <w:t>(Consent, Ownership and Use of Training Data)</w:t>
+      </w:r>
     </w:p>
     <w:p>
       <w:pPr>
@@ -666,13 +707,17 @@
         </w:numPr>
       </w:pPr>
       <w:r>
-        <w:t xml:space="preserve">(Employee overreliance on </w:t>
-      </w:r>
-      <w:proofErr w:type="gramStart"/>
-      <w:r>
-        <w:t>ai )</w:t>
-      </w:r>
-      <w:proofErr w:type="gramEnd"/>
+        <w:t>(Employee overreliance on ai)</w:t>
+      </w:r>
+      <w:r>
+        <w:t xml:space="preserve"> </w:t>
+      </w:r>
+      <w:r>
+        <w:rPr>
+          <w:highlight w:val="yellow"/>
+        </w:rPr>
+        <w:t>(AI Overreliance and Human Oversight)</w:t>
+      </w:r>
     </w:p>
     <w:p>
       <w:pPr>
@@ -685,6 +730,29 @@
       <w:r>
         <w:t xml:space="preserve">Data poisoning / inaccuracy </w:t>
       </w:r>
+      <w:r>
+        <w:rPr>
+          <w:highlight w:val="yellow"/>
+        </w:rPr>
+        <w:t>(AI Reliability, Data Quality and Data Poisoning)</w:t>
+      </w:r>
+    </w:p>
+    <w:p/>
+    <w:p>
+      <w:r>
+        <w:t>Focus on tension (business vs ethics)</w:t>
+      </w:r>
+    </w:p>
+    <w:p>
+      <w:r>
+        <w:t>Link to s1 to s3</w:t>
+      </w:r>
+    </w:p>
+    <w:p/>
+    <w:p>
+      <w:r>
+        <w:t>Recommendation</w:t>
+      </w:r>
     </w:p>
     <w:p>
       <w:pPr>
@@ -693,39 +761,9 @@
           <w:ilvl w:val="0"/>
           <w:numId w:val="3"/>
         </w:numPr>
-        <w:rPr>
-          <w:highlight w:val="yellow"/>
-        </w:rPr>
-      </w:pPr>
-      <w:r>
-        <w:rPr>
-          <w:highlight w:val="yellow"/>
-        </w:rPr>
-        <w:t xml:space="preserve">Take over </w:t>
-      </w:r>
-      <w:proofErr w:type="spellStart"/>
-      <w:r>
-        <w:rPr>
-          <w:highlight w:val="yellow"/>
-        </w:rPr>
-        <w:t>ppls</w:t>
-      </w:r>
-      <w:proofErr w:type="spellEnd"/>
-      <w:r>
-        <w:rPr>
-          <w:highlight w:val="yellow"/>
-        </w:rPr>
-        <w:t xml:space="preserve"> jobs?</w:t>
-      </w:r>
-    </w:p>
-    <w:p>
-      <w:pPr>
-        <w:pStyle w:val="ListParagraph"/>
-      </w:pPr>
-    </w:p>
-    <w:p>
-      <w:r>
-        <w:t>Recommendation</w:t>
+      </w:pPr>
+      <w:r>
+        <w:t>Find the benefits in key issues/findings</w:t>
       </w:r>
     </w:p>
     <w:p>
@@ -737,23 +775,542 @@
         </w:numPr>
       </w:pPr>
       <w:r>
-        <w:t>Find the benefits in key issues/findings</w:t>
-      </w:r>
-    </w:p>
-    <w:p>
-      <w:pPr>
-        <w:pStyle w:val="ListParagraph"/>
+        <w:t xml:space="preserve">Recommendation part </w:t>
+      </w:r>
+    </w:p>
+    <w:p/>
+    <w:p>
+      <w:r>
+        <w:br w:type="page"/>
+      </w:r>
+    </w:p>
+    <w:p>
+      <w:pPr>
+        <w:pStyle w:val="Heading1"/>
+        <w:rPr>
+          <w:rStyle w:val="Heading1Char"/>
+        </w:rPr>
+      </w:pPr>
+      <w:bookmarkStart w:id="1" w:name="_Toc240650085"/>
+      <w:r>
+        <w:rPr>
+          <w:rStyle w:val="Heading1Char"/>
+        </w:rPr>
+        <w:lastRenderedPageBreak/>
+        <w:t>Executive Summary</w:t>
+      </w:r>
+      <w:bookmarkEnd w:id="1"/>
+      <w:r>
+        <w:rPr>
+          <w:rStyle w:val="Heading1Char"/>
+        </w:rPr>
+        <w:t xml:space="preserve"> </w:t>
+      </w:r>
+    </w:p>
+    <w:p>
+      <w:pPr>
+        <w:rPr>
+          <w:rStyle w:val="Heading1Char"/>
+        </w:rPr>
+      </w:pPr>
+    </w:p>
+    <w:p>
+      <w:pPr>
+        <w:rPr>
+          <w:rStyle w:val="Heading1Char"/>
+        </w:rPr>
+      </w:pPr>
+      <w:r>
+        <w:rPr>
+          <w:rStyle w:val="Heading1Char"/>
+        </w:rPr>
+        <w:br w:type="page"/>
+      </w:r>
+    </w:p>
+    <w:p>
+      <w:bookmarkStart w:id="2" w:name="_Toc240650086"/>
+      <w:r>
+        <w:rPr>
+          <w:rStyle w:val="Heading1Char"/>
+        </w:rPr>
+        <w:lastRenderedPageBreak/>
+        <w:t>Introduction</w:t>
+      </w:r>
+      <w:bookmarkEnd w:id="2"/>
+      <w:r>
+        <w:t xml:space="preserve"> </w:t>
+      </w:r>
+      <w:r>
+        <w:t>(approx. 500-800 words</w:t>
+      </w:r>
+      <w:r>
+        <w:t>)</w:t>
+      </w:r>
+    </w:p>
+    <w:p/>
+    <w:p/>
+    <w:p>
+      <w:r>
+        <w:t xml:space="preserve">Artificial Intelligence (AI), i.e., computing machines designed to mimic multiple human intelligences such as the capabilities to do, think, and feel that </w:t>
+      </w:r>
+      <w:proofErr w:type="gramStart"/>
+      <w:r>
+        <w:t>are able to</w:t>
+      </w:r>
+      <w:proofErr w:type="gramEnd"/>
+      <w:r>
+        <w:t xml:space="preserve"> interpret external data, learn from such data, and use those learnings to achieve specific goals and tasks through flexible adaptation</w:t>
+      </w:r>
+      <w:r>
+        <w:t xml:space="preserve"> [1]. </w:t>
+      </w:r>
+      <w:r>
+        <w:t xml:space="preserve">Such amplification can go in positive as well as negative directions. On the positive side, AI helps companies to spot unethical </w:t>
+      </w:r>
+      <w:proofErr w:type="spellStart"/>
+      <w:r>
+        <w:t>behavior</w:t>
+      </w:r>
+      <w:proofErr w:type="spellEnd"/>
+      <w:r>
+        <w:t xml:space="preserve"> that previously might have been unnoticed.</w:t>
+      </w:r>
+      <w:r>
+        <w:t xml:space="preserve"> On the negative side, AI can raise</w:t>
+      </w:r>
+      <w:r>
+        <w:t xml:space="preserve"> ethical concerns and alters company-employee relationships.</w:t>
+      </w:r>
+      <w:r>
+        <w:t xml:space="preserve"> </w:t>
+      </w:r>
+    </w:p>
+    <w:p>
+      <w:r>
+        <w:t xml:space="preserve">Artificial intelligence (AI) is causing a revolution in business as well as the economy and society </w:t>
+      </w:r>
+      <w:proofErr w:type="gramStart"/>
+      <w:r>
+        <w:t>as a whole by</w:t>
+      </w:r>
+      <w:proofErr w:type="gramEnd"/>
+      <w:r>
+        <w:t xml:space="preserve"> changing the interactions and relationships that exist between stakeholders and individuals</w:t>
+      </w:r>
+      <w:r>
+        <w:t xml:space="preserve"> [</w:t>
+      </w:r>
+      <w:r>
+        <w:t>2</w:t>
+      </w:r>
+      <w:r>
+        <w:t>]</w:t>
+      </w:r>
+      <w:r>
+        <w:t xml:space="preserve">. </w:t>
+      </w:r>
+      <w:r>
+        <w:t>AI affects customers, businesses, and stakeholders in an increasingly automated and interconnected business world</w:t>
+      </w:r>
+      <w:r>
+        <w:t xml:space="preserve">. AI is used to handle customer interaction, store and manage data, handle company statistics and act as a database for employees. However, issues can rise between employees and the company especially for ethics. </w:t>
+      </w:r>
+      <w:r>
+        <w:t xml:space="preserve">Issues </w:t>
+      </w:r>
+      <w:r>
+        <w:t xml:space="preserve">can arise within the company based on how the company handles these issues ethically. </w:t>
+      </w:r>
+      <w:r>
+        <w:t xml:space="preserve">This report will focus on finding the issues between ethics and business and ai especially during the rise of ai. </w:t>
+      </w:r>
+    </w:p>
+    <w:p/>
+    <w:p>
+      <w:r>
+        <w:t>~~</w:t>
+      </w:r>
+    </w:p>
+    <w:p/>
+    <w:p>
+      <w:r>
+        <w:t>Artificial Intelligence (AI) has become an increasingly significant technology in modern organisations, influencing the way businesses operate, make decisions, and interact with their stakeholders. AI can be described as computing machines designed to mimic multiple forms of human intelligence, including the capabilities to perform tasks, think, interpret external data, learn from that data, and use those learnings to achieve specific goals through flexible adaptation [1]. As AI continues to develop, its influence is expanding beyond technical applications and becoming increasingly integrated into everyday business activities. Organisations are adopting AI to improve efficiency, reduce operational costs, support decision-making, manage large amounts of information, and provide faster and more personalised services. However, the increasing adoption of AI also creates questions about how businesses can balance the benefits of these technologies with their ethical responsibilities towards employees, customers, and other stakeholders.</w:t>
+      </w:r>
+      <w:r>
+        <w:t xml:space="preserve"> </w:t>
+      </w:r>
+      <w:r>
+        <w:t xml:space="preserve">The impact of AI on organisations can result in both positive and negative outcomes. On the positive side, AI can support businesses in </w:t>
+      </w:r>
+      <w:r>
+        <w:lastRenderedPageBreak/>
+        <w:t>identifying unethical or inappropriate behaviour that may previously have gone unnoticed</w:t>
+      </w:r>
+      <w:r>
+        <w:t xml:space="preserve">. </w:t>
+      </w:r>
+      <w:r>
+        <w:t>However, the same technology can also create new ethical concerns. The ability of AI to collect, analyse, and make decisions based on large quantities of data means that organisations must consider how these systems affect individual privacy, autonomy, fairness, and accountability.</w:t>
+      </w:r>
+      <w:r>
+        <w:t xml:space="preserve"> </w:t>
+      </w:r>
+      <w:r>
+        <w:t xml:space="preserve">Artificial intelligence is causing a significant transformation in business, the economy, and society </w:t>
+      </w:r>
+      <w:proofErr w:type="gramStart"/>
+      <w:r>
+        <w:t>as a whole by</w:t>
+      </w:r>
+      <w:proofErr w:type="gramEnd"/>
+      <w:r>
+        <w:t xml:space="preserve"> changing the interactions and relationships between individuals and stakeholders [2]. AI increasingly affects customers, employees, businesses, and other stakeholders within </w:t>
+      </w:r>
+      <w:r>
+        <w:t xml:space="preserve">a </w:t>
+      </w:r>
+      <w:r>
+        <w:t>business environment. Organisations use AI for a wide range of purposes, including handling customer interactions, storing and managing data, analysing company statistics, supporting business decisions, and providing employees with access to information</w:t>
+      </w:r>
+      <w:r>
+        <w:t xml:space="preserve">. </w:t>
+      </w:r>
+      <w:r>
+        <w:t>The tension between business objectives and ethical considerations becomes particularly important when organisations prioritise the benefits of AI, such as increased productivity, reduced costs, and improved competitiveness. Businesses naturally have an interest in adopting technologies that can provide these advantages. However, an organisation's responsibility does not necessarily end with achieving its commercial objectives. The implementation of AI may involve sensitive employee or customer information, automated decision-making, and systems whose outputs may not always be accurate or transparent. If these concerns are not properly addressed, businesses may face ethical problems involving privacy, consent, fairness, accountability, and trust. Therefore, the question is not simply whether businesses should use AI, but how AI can be implemented in a way that considers both organisational interests and the rights and expectations of stakeholders.</w:t>
+      </w:r>
+      <w:r>
+        <w:t xml:space="preserve"> </w:t>
+      </w:r>
+      <w:r>
+        <w:t>The rise of AI therefore presents businesses with a complex challenge. While AI can provide significant opportunities for organisations, its use also introduces ethical responsibilities that businesses must consider when developing and implementing AI systems. This report will investigate and analyse the tension between ethics and business in the use of Artificial Intelligence. It will examine how the adoption of AI can create ethical challenges for organisations while also providing important business benefits. Through this analysis, the report will consider how organisations can balance the opportunities offered by AI with the ethical responsibilities that arise from its increasing use.</w:t>
+      </w:r>
+    </w:p>
+    <w:p/>
+    <w:p>
+      <w:r>
+        <w:t>~~ 510 words</w:t>
+      </w:r>
+      <w:r>
+        <w:br w:type="page"/>
+      </w:r>
+    </w:p>
+    <w:p>
+      <w:bookmarkStart w:id="3" w:name="_Toc240650087"/>
+      <w:proofErr w:type="gramStart"/>
+      <w:r>
+        <w:rPr>
+          <w:rStyle w:val="Heading1Char"/>
+        </w:rPr>
+        <w:lastRenderedPageBreak/>
+        <w:t>F</w:t>
+      </w:r>
+      <w:r>
+        <w:rPr>
+          <w:rStyle w:val="Heading1Char"/>
+        </w:rPr>
+        <w:t>indings</w:t>
+      </w:r>
+      <w:bookmarkEnd w:id="3"/>
+      <w:r>
+        <w:rPr>
+          <w:rStyle w:val="Heading1Char"/>
+        </w:rPr>
+        <w:t xml:space="preserve"> </w:t>
+      </w:r>
+      <w:r>
+        <w:t xml:space="preserve"> ~</w:t>
+      </w:r>
+      <w:proofErr w:type="gramEnd"/>
+      <w:r>
+        <w:t xml:space="preserve"> </w:t>
+      </w:r>
+      <w:r>
+        <w:t>1,800-2,500 words</w:t>
+      </w:r>
+    </w:p>
+    <w:p/>
+    <w:p>
+      <w:r>
+        <w:t>Link to the sources (S1-S3)</w:t>
+      </w:r>
+    </w:p>
+    <w:p/>
+    <w:p>
+      <w:r>
+        <w:rPr>
+          <w:highlight w:val="yellow"/>
+        </w:rPr>
+        <w:t>Source 1 (</w:t>
+      </w:r>
+      <w:r>
+        <w:rPr>
+          <w:highlight w:val="yellow"/>
+        </w:rPr>
+        <w:t xml:space="preserve">Australia’s AI Ethics Principles) </w:t>
+      </w:r>
+    </w:p>
+    <w:p>
+      <w:hyperlink r:id="rId8" w:history="1">
+        <w:r>
+          <w:rPr>
+            <w:rStyle w:val="Hyperlink"/>
+          </w:rPr>
+          <w:t>https://www.industry.gov.au/publications/australias-ai-ethics-principles</w:t>
+        </w:r>
+      </w:hyperlink>
+    </w:p>
+    <w:p/>
+    <w:p>
+      <w:r>
+        <w:rPr>
+          <w:highlight w:val="cyan"/>
+        </w:rPr>
+        <w:t>[public distrust in business using ai (Public Trust, Transparency and Accountability)]</w:t>
+      </w:r>
+    </w:p>
+    <w:p/>
+    <w:p>
+      <w:r>
+        <w:rPr>
+          <w:highlight w:val="yellow"/>
+        </w:rPr>
+        <w:t>Transparency and explainability</w:t>
+      </w:r>
+    </w:p>
+    <w:p>
+      <w:r>
+        <w:t xml:space="preserve">There should be transparency and responsible disclosure so people can understand when they are being significantly impacted by </w:t>
+      </w:r>
+      <w:proofErr w:type="gramStart"/>
+      <w:r>
+        <w:t>AI, and</w:t>
+      </w:r>
+      <w:proofErr w:type="gramEnd"/>
+      <w:r>
+        <w:t xml:space="preserve"> can find out when an AI system is engaging with them.</w:t>
+      </w:r>
+    </w:p>
+    <w:p/>
+    <w:p>
+      <w:pPr>
+        <w:rPr>
+          <w:color w:val="000000" w:themeColor="text1"/>
+        </w:rPr>
+      </w:pPr>
+      <w:r>
+        <w:rPr>
+          <w:color w:val="000000" w:themeColor="text1"/>
+        </w:rPr>
+        <w:t>Achieving transparency in AI systems through responsible disclosure is important to each stakeholder group for the following reasons:</w:t>
+      </w:r>
+    </w:p>
+    <w:p>
+      <w:pPr>
         <w:numPr>
           <w:ilvl w:val="0"/>
-          <w:numId w:val="3"/>
+          <w:numId w:val="18"/>
         </w:numPr>
-      </w:pPr>
-      <w:r>
-        <w:t xml:space="preserve">Recommendation part </w:t>
-      </w:r>
-    </w:p>
-    <w:p/>
-    <w:p>
+        <w:rPr>
+          <w:color w:val="000000" w:themeColor="text1"/>
+        </w:rPr>
+      </w:pPr>
+      <w:r>
+        <w:rPr>
+          <w:color w:val="000000" w:themeColor="text1"/>
+        </w:rPr>
+        <w:t>for users, what the system is doing and why</w:t>
+      </w:r>
+    </w:p>
+    <w:p>
+      <w:pPr>
+        <w:numPr>
+          <w:ilvl w:val="0"/>
+          <w:numId w:val="18"/>
+        </w:numPr>
+        <w:shd w:val="clear" w:color="auto" w:fill="FFFFFF"/>
+        <w:spacing w:before="100" w:beforeAutospacing="1" w:after="100" w:afterAutospacing="1" w:line="240" w:lineRule="auto"/>
+        <w:rPr>
+          <w:rFonts w:eastAsia="Times New Roman" w:cs="Segoe UI"/>
+          <w:color w:val="000000" w:themeColor="text1"/>
+          <w:kern w:val="0"/>
+          <w:lang w:eastAsia="en-MY"/>
+          <w14:ligatures w14:val="none"/>
+        </w:rPr>
+      </w:pPr>
+      <w:r>
+        <w:rPr>
+          <w:rFonts w:eastAsia="Times New Roman" w:cs="Segoe UI"/>
+          <w:color w:val="000000" w:themeColor="text1"/>
+          <w:kern w:val="0"/>
+          <w:lang w:eastAsia="en-MY"/>
+          <w14:ligatures w14:val="none"/>
+        </w:rPr>
+        <w:t>for the public, to build confidence in the technology</w:t>
+      </w:r>
+    </w:p>
+    <w:p>
+      <w:pPr>
+        <w:numPr>
+          <w:ilvl w:val="0"/>
+          <w:numId w:val="18"/>
+        </w:numPr>
+        <w:shd w:val="clear" w:color="auto" w:fill="FFFFFF"/>
+        <w:spacing w:before="100" w:beforeAutospacing="1" w:after="100" w:afterAutospacing="1" w:line="240" w:lineRule="auto"/>
+        <w:rPr>
+          <w:rFonts w:eastAsia="Times New Roman" w:cs="Segoe UI"/>
+          <w:color w:val="000000" w:themeColor="text1"/>
+          <w:kern w:val="0"/>
+          <w:lang w:eastAsia="en-MY"/>
+          <w14:ligatures w14:val="none"/>
+        </w:rPr>
+      </w:pPr>
+      <w:r>
+        <w:rPr>
+          <w:rFonts w:eastAsia="Times New Roman" w:cs="Segoe UI"/>
+          <w:color w:val="000000" w:themeColor="text1"/>
+          <w:kern w:val="0"/>
+          <w:lang w:eastAsia="en-MY"/>
+          <w14:ligatures w14:val="none"/>
+        </w:rPr>
+        <w:t>for those deploying and operating the system, to understand processes and input data</w:t>
+      </w:r>
+    </w:p>
+    <w:p>
+      <w:pPr>
+        <w:rPr>
+          <w:rFonts w:eastAsia="Times New Roman" w:cs="Segoe UI"/>
+          <w:color w:val="000000" w:themeColor="text1"/>
+          <w:kern w:val="0"/>
+          <w:lang w:eastAsia="en-MY"/>
+          <w14:ligatures w14:val="none"/>
+        </w:rPr>
+      </w:pPr>
+    </w:p>
+    <w:p>
+      <w:r>
+        <w:rPr>
+          <w:highlight w:val="cyan"/>
+        </w:rPr>
+        <w:t>employee data leak/sensitive data shared to ai? (Employee Privacy and Sensitive Data)</w:t>
+      </w:r>
+    </w:p>
+    <w:p/>
+    <w:p>
+      <w:r>
+        <w:rPr>
+          <w:highlight w:val="yellow"/>
+        </w:rPr>
+        <w:t>Reliability and safety</w:t>
+      </w:r>
+    </w:p>
+    <w:p/>
+    <w:p>
+      <w:r>
+        <w:t>This principle aims to ensure respect for privacy and data protection when using AI systems. This includes ensuring proper data governance, and management, for all data used and generated by the AI system throughout its lifecycle.</w:t>
+      </w:r>
+      <w:r>
+        <w:t xml:space="preserve"> </w:t>
+      </w:r>
+    </w:p>
+    <w:p>
+      <w:r>
+        <w:t xml:space="preserve">This includes the identification of potential security vulnerabilities, and assurance of resilience to adversarial attacks. Security measures should account for unintended </w:t>
+      </w:r>
+      <w:r>
+        <w:lastRenderedPageBreak/>
+        <w:t>applications of AI systems, and potential abuse risks, with appropriate mitigation measures.</w:t>
+      </w:r>
+    </w:p>
+    <w:p/>
+    <w:p/>
+    <w:p>
+      <w:r>
+        <w:rPr>
+          <w:highlight w:val="cyan"/>
+        </w:rPr>
+        <w:t>(Employee overreliance on ai) (AI Overreliance and Human Oversight)</w:t>
+      </w:r>
+    </w:p>
+    <w:p/>
+    <w:p>
+      <w:r>
+        <w:rPr>
+          <w:highlight w:val="yellow"/>
+        </w:rPr>
+        <w:t>Accountability</w:t>
+      </w:r>
+    </w:p>
+    <w:p/>
+    <w:p>
+      <w:r>
+        <w:t xml:space="preserve">Mechanisms should be put in place to ensure responsibility and accountability for AI systems and their outcomes. This includes both before and after their design, development, deployment and operation. The organisation and individual accountable for the decision should be identifiable as necessary. They must consider the appropriate level of human control or oversight for the </w:t>
+      </w:r>
+      <w:proofErr w:type="gramStart"/>
+      <w:r>
+        <w:t>particular AI</w:t>
+      </w:r>
+      <w:proofErr w:type="gramEnd"/>
+      <w:r>
+        <w:t xml:space="preserve"> system or use case.</w:t>
+      </w:r>
+    </w:p>
+    <w:p/>
+    <w:p>
+      <w:r>
+        <w:rPr>
+          <w:highlight w:val="cyan"/>
+        </w:rPr>
+        <w:t>Data poisoning / inaccuracy (AI Reliability, Data Quality and Data Poisoning)</w:t>
+      </w:r>
+    </w:p>
+    <w:p/>
+    <w:p>
+      <w:pPr>
+        <w:pStyle w:val="Heading3"/>
+        <w:shd w:val="clear" w:color="auto" w:fill="FFFFFF"/>
+        <w:rPr>
+          <w:rFonts w:cs="Segoe UI"/>
+          <w:color w:val="000000" w:themeColor="text1"/>
+        </w:rPr>
+      </w:pPr>
+      <w:r>
+        <w:rPr>
+          <w:rFonts w:cs="Segoe UI"/>
+          <w:color w:val="000000" w:themeColor="text1"/>
+          <w:highlight w:val="yellow"/>
+        </w:rPr>
+        <w:t>Reliability and safety</w:t>
+      </w:r>
+    </w:p>
+    <w:p/>
+    <w:p>
+      <w:r>
+        <w:t xml:space="preserve">AI systems should not pose unreasonable safety </w:t>
+      </w:r>
+      <w:proofErr w:type="gramStart"/>
+      <w:r>
+        <w:t>risks, and</w:t>
+      </w:r>
+      <w:proofErr w:type="gramEnd"/>
+      <w:r>
+        <w:t xml:space="preserve"> should adopt safety measures that are proportionate to the magnitude of potential risks. AI systems should be monitored and tested to ensure they continue to meet their intended purpose, and any identified problems should be addressed with ongoing risk management as appropriate.</w:t>
+      </w:r>
+    </w:p>
+    <w:p/>
+    <w:p/>
+    <w:p/>
+    <w:p/>
+    <w:p/>
+    <w:p>
+      <w:pPr>
+        <w:rPr>
+          <w:rFonts w:asciiTheme="majorHAnsi" w:eastAsiaTheme="majorEastAsia" w:hAnsiTheme="majorHAnsi" w:cstheme="majorBidi"/>
+          <w:color w:val="000000" w:themeColor="text1"/>
+          <w:sz w:val="40"/>
+          <w:szCs w:val="40"/>
+        </w:rPr>
+      </w:pPr>
+      <w:bookmarkStart w:id="4" w:name="_Toc240650088"/>
       <w:r>
         <w:br w:type="page"/>
       </w:r>
@@ -761,260 +1318,7 @@
     <w:p>
       <w:pPr>
         <w:pStyle w:val="Heading1"/>
-        <w:rPr>
-          <w:rStyle w:val="Heading1Char"/>
-        </w:rPr>
-      </w:pPr>
-      <w:bookmarkStart w:id="1" w:name="_Toc240650085"/>
-      <w:r>
-        <w:rPr>
-          <w:rStyle w:val="Heading1Char"/>
-        </w:rPr>
-        <w:lastRenderedPageBreak/>
-        <w:t>Executive Summary</w:t>
-      </w:r>
-      <w:bookmarkEnd w:id="1"/>
-      <w:r>
-        <w:rPr>
-          <w:rStyle w:val="Heading1Char"/>
-        </w:rPr>
-        <w:t xml:space="preserve"> </w:t>
-      </w:r>
-    </w:p>
-    <w:p>
-      <w:pPr>
-        <w:rPr>
-          <w:rStyle w:val="Heading1Char"/>
-        </w:rPr>
-      </w:pPr>
-    </w:p>
-    <w:p>
-      <w:pPr>
-        <w:rPr>
-          <w:rStyle w:val="Heading1Char"/>
-        </w:rPr>
-      </w:pPr>
-      <w:r>
-        <w:rPr>
-          <w:rStyle w:val="Heading1Char"/>
-        </w:rPr>
-        <w:br w:type="page"/>
-      </w:r>
-    </w:p>
-    <w:p>
-      <w:bookmarkStart w:id="2" w:name="_Toc240650086"/>
-      <w:r>
-        <w:rPr>
-          <w:rStyle w:val="Heading1Char"/>
-        </w:rPr>
-        <w:lastRenderedPageBreak/>
-        <w:t>Introduction</w:t>
-      </w:r>
-      <w:bookmarkEnd w:id="2"/>
-      <w:r>
-        <w:t xml:space="preserve"> </w:t>
-      </w:r>
-      <w:r>
-        <w:t>(approx. 500-800 words</w:t>
-      </w:r>
-      <w:r>
-        <w:t>)</w:t>
-      </w:r>
-    </w:p>
-    <w:p/>
-    <w:p/>
-    <w:p>
-      <w:r>
-        <w:t xml:space="preserve">Artificial Intelligence (AI), i.e., computing machines designed to mimic multiple human intelligences such as the capabilities to do, think, and feel that </w:t>
-      </w:r>
-      <w:proofErr w:type="gramStart"/>
-      <w:r>
-        <w:t>are able to</w:t>
-      </w:r>
-      <w:proofErr w:type="gramEnd"/>
-      <w:r>
-        <w:t xml:space="preserve"> interpret external data, learn from such data, and use those learnings to achieve specific goals and tasks through flexible adaptation</w:t>
-      </w:r>
-      <w:r>
-        <w:t xml:space="preserve"> [1]. </w:t>
-      </w:r>
-      <w:r>
-        <w:t xml:space="preserve">Such amplification can go in positive as well as negative directions. On the positive side, AI helps companies to spot unethical </w:t>
-      </w:r>
-      <w:proofErr w:type="spellStart"/>
-      <w:r>
-        <w:t>behavior</w:t>
-      </w:r>
-      <w:proofErr w:type="spellEnd"/>
-      <w:r>
-        <w:t xml:space="preserve"> that previously might have been unnoticed.</w:t>
-      </w:r>
-      <w:r>
-        <w:t xml:space="preserve"> On the negative side, AI can raise</w:t>
-      </w:r>
-      <w:r>
-        <w:t xml:space="preserve"> ethical concerns and alters company-employee relationships.</w:t>
-      </w:r>
-      <w:r>
-        <w:t xml:space="preserve"> </w:t>
-      </w:r>
-    </w:p>
-    <w:p>
-      <w:r>
-        <w:t xml:space="preserve">Artificial intelligence (AI) is causing a revolution in business as well as the economy and society </w:t>
-      </w:r>
-      <w:proofErr w:type="gramStart"/>
-      <w:r>
-        <w:t>as a whole by</w:t>
-      </w:r>
-      <w:proofErr w:type="gramEnd"/>
-      <w:r>
-        <w:t xml:space="preserve"> changing the interactions and relationships that exist between stakeholders and individuals</w:t>
-      </w:r>
-      <w:r>
-        <w:t xml:space="preserve"> [</w:t>
-      </w:r>
-      <w:r>
-        <w:t>2</w:t>
-      </w:r>
-      <w:r>
-        <w:t>]</w:t>
-      </w:r>
-      <w:r>
-        <w:t xml:space="preserve">. </w:t>
-      </w:r>
-      <w:r>
-        <w:t>AI affects customers, businesses, and stakeholders in an increasingly automated and interconnected business world</w:t>
-      </w:r>
-      <w:r>
-        <w:t xml:space="preserve">. AI is used to handle customer interaction, store and manage data, handle company statistics and act as a database for employees. However, issues can rise between employees and the company especially for ethics. </w:t>
-      </w:r>
-      <w:r>
-        <w:t xml:space="preserve">Issues </w:t>
-      </w:r>
-      <w:r>
-        <w:t xml:space="preserve">can arise within the company based on how the company handles these issues ethically. </w:t>
-      </w:r>
-      <w:r>
-        <w:t xml:space="preserve">This report will focus on finding the issues between ethics and business and ai especially during the rise of ai. </w:t>
-      </w:r>
-    </w:p>
-    <w:p/>
-    <w:p>
-      <w:r>
-        <w:t>~~</w:t>
-      </w:r>
-    </w:p>
-    <w:p/>
-    <w:p>
-      <w:r>
-        <w:t>Artificial Intelligence (AI) has become an increasingly significant technology in modern organisations, influencing the way businesses operate, make decisions, and interact with their stakeholders. AI can be described as computing machines designed to mimic multiple forms of human intelligence, including the capabilities to perform tasks, think, interpret external data, learn from that data, and use those learnings to achieve specific goals through flexible adaptation [1]. As AI continues to develop, its influence is expanding beyond technical applications and becoming increasingly integrated into everyday business activities. Organisations are adopting AI to improve efficiency, reduce operational costs, support decision-making, manage large amounts of information, and provide faster and more personalised services. However, the increasing adoption of AI also creates questions about how businesses can balance the benefits of these technologies with their ethical responsibilities towards employees, customers, and other stakeholders.</w:t>
-      </w:r>
-      <w:r>
-        <w:t xml:space="preserve"> </w:t>
-      </w:r>
-      <w:r>
-        <w:t xml:space="preserve">The impact of AI on organisations can result in both positive and negative outcomes. On the positive side, AI can support businesses in </w:t>
-      </w:r>
-      <w:r>
-        <w:lastRenderedPageBreak/>
-        <w:t>identifying unethical or inappropriate behaviour that may previously have gone unnoticed</w:t>
-      </w:r>
-      <w:r>
-        <w:t xml:space="preserve">. </w:t>
-      </w:r>
-      <w:r>
-        <w:t>However, the same technology can also create new ethical concerns. The ability of AI to collect, analyse, and make decisions based on large quantities of data means that organisations must consider how these systems affect individual privacy, autonomy, fairness, and accountability.</w:t>
-      </w:r>
-      <w:r>
-        <w:t xml:space="preserve"> </w:t>
-      </w:r>
-      <w:r>
-        <w:t xml:space="preserve">Artificial intelligence is causing a significant transformation in business, the economy, and society </w:t>
-      </w:r>
-      <w:proofErr w:type="gramStart"/>
-      <w:r>
-        <w:t>as a whole by</w:t>
-      </w:r>
-      <w:proofErr w:type="gramEnd"/>
-      <w:r>
-        <w:t xml:space="preserve"> changing the interactions and relationships between individuals and stakeholders [2]. AI increasingly affects customers, employees, businesses, and other stakeholders within </w:t>
-      </w:r>
-      <w:r>
-        <w:t xml:space="preserve">a </w:t>
-      </w:r>
-      <w:r>
-        <w:t>business environment. Organisations use AI for a wide range of purposes, including handling customer interactions, storing and managing data, analysing company statistics, supporting business decisions, and providing employees with access to information</w:t>
-      </w:r>
-      <w:r>
-        <w:t xml:space="preserve">. </w:t>
-      </w:r>
-      <w:r>
-        <w:t>The tension between business objectives and ethical considerations becomes particularly important when organisations prioritise the benefits of AI, such as increased productivity, reduced costs, and improved competitiveness. Businesses naturally have an interest in adopting technologies that can provide these advantages. However, an organisation's responsibility does not necessarily end with achieving its commercial objectives. The implementation of AI may involve sensitive employee or customer information, automated decision-making, and systems whose outputs may not always be accurate or transparent. If these concerns are not properly addressed, businesses may face ethical problems involving privacy, consent, fairness, accountability, and trust. Therefore, the question is not simply whether businesses should use AI, but how AI can be implemented in a way that considers both organisational interests and the rights and expectations of stakeholders.</w:t>
-      </w:r>
-      <w:r>
-        <w:t xml:space="preserve"> </w:t>
-      </w:r>
-      <w:r>
-        <w:t>The rise of AI therefore presents businesses with a complex challenge. While AI can provide significant opportunities for organisations, its use also introduces ethical responsibilities that businesses must consider when developing and implementing AI systems. This report will investigate and analyse the tension between ethics and business in the use of Artificial Intelligence. It will examine how the adoption of AI can create ethical challenges for organisations while also providing important business benefits. Through this analysis, the report will consider how organisations can balance the opportunities offered by AI with the ethical responsibilities that arise from its increasing use.</w:t>
-      </w:r>
-    </w:p>
-    <w:p>
-      <w:r>
-        <w:br w:type="page"/>
-      </w:r>
-    </w:p>
-    <w:p>
-      <w:bookmarkStart w:id="3" w:name="_Toc240650087"/>
-      <w:proofErr w:type="gramStart"/>
-      <w:r>
-        <w:rPr>
-          <w:rStyle w:val="Heading1Char"/>
-        </w:rPr>
-        <w:lastRenderedPageBreak/>
-        <w:t>F</w:t>
-      </w:r>
-      <w:r>
-        <w:rPr>
-          <w:rStyle w:val="Heading1Char"/>
-        </w:rPr>
-        <w:t>indings</w:t>
-      </w:r>
-      <w:bookmarkEnd w:id="3"/>
-      <w:r>
-        <w:rPr>
-          <w:rStyle w:val="Heading1Char"/>
-        </w:rPr>
-        <w:t xml:space="preserve"> </w:t>
-      </w:r>
-      <w:r>
-        <w:t xml:space="preserve"> ~</w:t>
-      </w:r>
-      <w:proofErr w:type="gramEnd"/>
-      <w:r>
-        <w:t xml:space="preserve"> </w:t>
-      </w:r>
-      <w:r>
-        <w:t>1,800-2,500 words</w:t>
-      </w:r>
-    </w:p>
-    <w:p/>
-    <w:p>
-      <w:r>
-        <w:t>dd</w:t>
-      </w:r>
-    </w:p>
-    <w:p/>
-    <w:p>
-      <w:r>
-        <w:br w:type="page"/>
-      </w:r>
-    </w:p>
-    <w:p>
-      <w:pPr>
-        <w:pStyle w:val="Heading1"/>
-      </w:pPr>
-      <w:bookmarkStart w:id="4" w:name="_Toc240650088"/>
+      </w:pPr>
       <w:r>
         <w:lastRenderedPageBreak/>
         <w:t>References</w:t>
@@ -1045,7 +1349,7 @@
           <w:numId w:val="17"/>
         </w:numPr>
       </w:pPr>
-      <w:hyperlink r:id="rId8" w:history="1">
+      <w:hyperlink r:id="rId9" w:history="1">
         <w:r>
           <w:rPr>
             <w:rStyle w:val="Hyperlink"/>
@@ -1099,30 +1403,74 @@
           <w:numId w:val="17"/>
         </w:numPr>
       </w:pPr>
-      <w:hyperlink r:id="rId9" w:history="1">
-        <w:r>
-          <w:rPr>
-            <w:rStyle w:val="Hyperlink"/>
-          </w:rPr>
-          <w:t>https://www.academia.edu/download/123707107/1776.pdf</w:t>
-        </w:r>
-      </w:hyperlink>
+      <w:r>
+        <w:fldChar w:fldCharType="begin"/>
+      </w:r>
+      <w:r>
+        <w:instrText>HYPERLINK "https://www.academia.edu/download/123707107/1776.pdf"</w:instrText>
+      </w:r>
+      <w:r>
+        <w:fldChar w:fldCharType="separate"/>
+      </w:r>
+      <w:r>
+        <w:rPr>
+          <w:rStyle w:val="Hyperlink"/>
+        </w:rPr>
+        <w:t>https://www.academia.edu/download/123707107/1776.pdf</w:t>
+      </w:r>
+      <w:r>
+        <w:fldChar w:fldCharType="end"/>
+      </w:r>
       <w:r>
         <w:t xml:space="preserve"> </w:t>
       </w:r>
-      <w:hyperlink r:id="rId10" w:history="1">
-        <w:r>
-          <w:rPr>
-            <w:rStyle w:val="Hyperlink"/>
-          </w:rPr>
-          <w:t>https://d1wqtxts1xzle7.cloudfront.net/123707107/1776-libre.pdf?1752175572=&amp;response-content-disposition=inline%3B+filename%3DRise_of_Artificial_Intelligence_in_Busin.pdf&amp;Expires=1789729417&amp;Signature=aXbSWl7zsu8Ghrag5Z65nxIIkkGd~5o~NB7a3q94DfZIasd59Sg6BoFXuEOit4x7gZh~p2zZFEDCKiWJssLj9Pr6ULmV8vIhDAZM3xf9ORiccxAbOayB1oKidODMRgOkRul8Dbr8tGMAlNTsV~u~FdAf8yhJGfHoH3l7OWfc~c9Dzp9814~XQN77WQJQTrpanAETQDVbmejiNztvVRfFtk5wPV5mUizm-x2cd6sv~azmmjxSf6GJT8uiaMBlqUDmUGyqttGC4Tth3Sk3XcYOH6qKnmuJco5hhoz4qbcjJHeWNv3jDa87fG7AfvLDuG5ZhLlhvlJPXumUtCRspOrFJQ__&amp;Key-Pair-Id=APKAJLOHF5GGSLRBV4ZA</w:t>
-        </w:r>
-      </w:hyperlink>
-    </w:p>
-    <w:p/>
-    <w:p>
-      <w:r>
-        <w:t xml:space="preserve">[1] </w:t>
+      <w:r>
+        <w:fldChar w:fldCharType="begin"/>
+      </w:r>
+      <w:r>
+        <w:instrText>HYPERLINK "https://d1wqtxts1xzle7.cloudfront.net/123707107/1776-libre.pdf?1752175572=&amp;response-content-disposition=inline%3B+filename%3DRise_of_Artificial_Intelligence_in_Busin.pdf&amp;Expires=1789729417&amp;Signature=aXbSWl7zsu8Ghrag5Z65nxIIkkGd~5o~NB7a3q94DfZIasd59Sg6BoFXuEOit4x7gZh~p2zZFEDCKiWJssLj9Pr6ULmV8vIhDAZM3xf9ORiccxAbOayB1oKidODMRgOkRul8Dbr8tGMAlNTsV~u~FdAf8yhJGfHoH3l7OWfc~c9Dzp9814~XQN77WQJQTrpanAETQDVbmejiNztvVRfFtk5wPV5mUizm-x2cd6sv~azmmjxSf6GJT8uiaMBlqUDmUGyqttGC4Tth3Sk3XcYOH6qKnmuJco5hhoz4qbcjJHeWNv3jDa87fG7AfvLDuG5ZhLlhvlJPXumUtCRspOrFJQ__&amp;Key-Pair-Id=APKAJLOHF5GGSLRBV4ZA"</w:instrText>
+      </w:r>
+      <w:r>
+        <w:fldChar w:fldCharType="separate"/>
+      </w:r>
+      <w:r>
+        <w:rPr>
+          <w:rStyle w:val="Hyperlink"/>
+        </w:rPr>
+        <w:t>https://d1wqtxts1xzle7.cloudfront.net/123707107/1776-libre.pdf?1752175572=&amp;response-content-dispositio</w:t>
+      </w:r>
+      <w:r>
+        <w:rPr>
+          <w:rStyle w:val="Hyperlink"/>
+        </w:rPr>
+        <w:t>n=in</w:t>
+      </w:r>
+      <w:r>
+        <w:rPr>
+          <w:rStyle w:val="Hyperlink"/>
+        </w:rPr>
+        <w:t>l</w:t>
+      </w:r>
+      <w:r>
+        <w:rPr>
+          <w:rStyle w:val="Hyperlink"/>
+        </w:rPr>
+        <w:t>ine%3B+filename%3DRise_of_Artificial_Intelligence_in_Busin.pdf&amp;Expires=1789729417&amp;Signature=aXbSWl7zsu8Ghrag5Z65nxIIkkGd~5o~NB7a3q94DfZIasd59Sg6BoFXuEOit4x7gZh~p2zZFEDCKiWJssLj9Pr6ULmV8vIhDAZM3xf9ORiccxAbOayB1oKidODMRgOkRul8Dbr8tGMAlNTsV~u~FdAf8yhJGfHoH3l7OWfc~c9Dzp9814~XQN77WQJQTrpanAETQDVbmejiNztvVRfFtk5wPV5mUizm-x2cd6sv~azmmjxSf6GJT8uiaMBlqUDmUGyqttGC4Tth3Sk3XcYOH6qKnmuJco5hhoz4qbcjJHeWNv3jDa87fG7AfvLDuG5ZhLlhvlJPXumUtCRspOrFJQ__&amp;Key-Pair-Id=APKAJLOHF5GGSLRBV4ZA</w:t>
+      </w:r>
+      <w:r>
+        <w:fldChar w:fldCharType="end"/>
+      </w:r>
+    </w:p>
+    <w:p/>
+    <w:p>
+      <w:r>
+        <w:t>[</w:t>
+      </w:r>
+      <w:r>
+        <w:t>2</w:t>
+      </w:r>
+      <w:r>
+        <w:t xml:space="preserve">] </w:t>
       </w:r>
       <w:r>
         <w:t xml:space="preserve">J. P. </w:t>
@@ -1214,7 +1562,7 @@
           <w:numId w:val="4"/>
         </w:numPr>
       </w:pPr>
-      <w:hyperlink r:id="rId11" w:history="1">
+      <w:hyperlink r:id="rId10" w:history="1">
         <w:r>
           <w:rPr>
             <w:rStyle w:val="Hyperlink"/>
@@ -1262,7 +1610,7 @@
           <w:numId w:val="4"/>
         </w:numPr>
       </w:pPr>
-      <w:hyperlink r:id="rId12" w:history="1">
+      <w:hyperlink r:id="rId11" w:history="1">
         <w:r>
           <w:rPr>
             <w:rStyle w:val="Hyperlink"/>
@@ -1275,7 +1623,7 @@
       <w:r>
         <w:t>Illia et al. [</w:t>
       </w:r>
-      <w:hyperlink r:id="rId13" w:anchor="ref-CR58" w:tooltip="Illia, L., Colleoni, E., Zyglidopoulos, S.: Ethical implications of text generation in the age of artificial intelligence. Bus. Ethics Environ. Responsib. 32, 201–210 (2023). &#10;                  https://doi.org/10.1111/beer.12479&#10;                  &#10;            " w:history="1">
+      <w:hyperlink r:id="rId12" w:anchor="ref-CR58" w:tooltip="Illia, L., Colleoni, E., Zyglidopoulos, S.: Ethical implications of text generation in the age of artificial intelligence. Bus. Ethics Environ. Responsib. 32, 201–210 (2023). &#10;                  https://doi.org/10.1111/beer.12479&#10;                  &#10;            " w:history="1">
         <w:r>
           <w:rPr>
             <w:rStyle w:val="Hyperlink"/>
@@ -1314,7 +1662,7 @@
           <w:numId w:val="4"/>
         </w:numPr>
       </w:pPr>
-      <w:hyperlink r:id="rId14" w:history="1">
+      <w:hyperlink r:id="rId13" w:history="1">
         <w:r>
           <w:rPr>
             <w:rStyle w:val="Hyperlink"/>
@@ -1353,24 +1701,12 @@
           <w:numId w:val="14"/>
         </w:numPr>
       </w:pPr>
-      <w:hyperlink r:id="rId15" w:history="1">
+      <w:hyperlink r:id="rId14" w:history="1">
         <w:r>
           <w:rPr>
             <w:rStyle w:val="Hyperlink"/>
           </w:rPr>
-          <w:t>https://link.springer.com/article/1</w:t>
-        </w:r>
-        <w:r>
-          <w:rPr>
-            <w:rStyle w:val="Hyperlink"/>
-          </w:rPr>
-          <w:t>0</w:t>
-        </w:r>
-        <w:r>
-          <w:rPr>
-            <w:rStyle w:val="Hyperlink"/>
-          </w:rPr>
-          <w:t>.1007/S43681-024-00443-4</w:t>
+          <w:t>https://link.springer.com/article/10.1007/S43681-024-00443-4</w:t>
         </w:r>
       </w:hyperlink>
     </w:p>
@@ -1379,7 +1715,7 @@
       <w:r>
         <w:t>Historically, data seeding has been used to influence Internet users through data propagation and search engine optimisation [</w:t>
       </w:r>
-      <w:hyperlink r:id="rId16" w:anchor="ref-CR70" w:tooltip="Gelper, S., van der Lans, R., van Bruggen, G.: Competition for attention in online social networks: Implications for seeding strategies. Manage. Sci. 67, 1026–1047 (2021)" w:history="1">
+      <w:hyperlink r:id="rId15" w:anchor="ref-CR70" w:tooltip="Gelper, S., van der Lans, R., van Bruggen, G.: Competition for attention in online social networks: Implications for seeding strategies. Manage. Sci. 67, 1026–1047 (2021)" w:history="1">
         <w:r>
           <w:rPr>
             <w:rStyle w:val="Hyperlink"/>
@@ -1400,7 +1736,7 @@
         <w:lastRenderedPageBreak/>
         <w:t>Further research indicated that an attacker only needs to control 0.01% of a dataset to poison it, which could be done for a cost of just US$60 [</w:t>
       </w:r>
-      <w:hyperlink r:id="rId17" w:anchor="ref-CR34" w:tooltip="Carlini, N., Jagielski, M., Choquette-Choo, C.A., Paleka, D., Pearce, W., Anderson, H., Terzis, A., Thomas, K., Tramèr, F.: Poisoning Web-Scale Training Datasets is Practical. (2023). ArXiv abs/2302.10149" w:history="1">
+      <w:hyperlink r:id="rId16" w:anchor="ref-CR34" w:tooltip="Carlini, N., Jagielski, M., Choquette-Choo, C.A., Paleka, D., Pearce, W., Anderson, H., Terzis, A., Thomas, K., Tramèr, F.: Poisoning Web-Scale Training Datasets is Practical. (2023). ArXiv abs/2302.10149" w:history="1">
         <w:r>
           <w:rPr>
             <w:rStyle w:val="Hyperlink"/>
@@ -1423,7 +1759,7 @@
       <w:r>
         <w:t>LLMs are generally built with safeguards around generating contents that are harmful and misaligned with common moral and ethical standards. However, several researchers have demonstrated that using specific or augmented prompts can bypass the safety measures and trick these models into providing harmful content. Typically referred to as “jailbreaking,” there are numerous online resources that provide instruction to users on developing prompts that will bypass the controls of the AI engine [</w:t>
       </w:r>
-      <w:hyperlink r:id="rId18" w:anchor="ref-CR76" w:tooltip="Boxleitner, A.: Pushing Boundaries or Crossing Lines? The Complex Ethics of ChatGPT Jailbreaking. The Complex Ethics of ChatGPT JailbreakingOctober 17, (2023) (2023)" w:history="1">
+      <w:hyperlink r:id="rId17" w:anchor="ref-CR76" w:tooltip="Boxleitner, A.: Pushing Boundaries or Crossing Lines? The Complex Ethics of ChatGPT Jailbreaking. The Complex Ethics of ChatGPT JailbreakingOctober 17, (2023) (2023)" w:history="1">
         <w:r>
           <w:rPr>
             <w:rStyle w:val="Hyperlink"/>
@@ -1444,7 +1780,7 @@
           <w:numId w:val="14"/>
         </w:numPr>
       </w:pPr>
-      <w:hyperlink r:id="rId19" w:history="1">
+      <w:hyperlink r:id="rId18" w:history="1">
         <w:r>
           <w:rPr>
             <w:rStyle w:val="Hyperlink"/>
@@ -1463,7 +1799,7 @@
       <w:r>
         <w:t>Another emblematic case is Tay, Microsoft's AI-enabled chatbot (see </w:t>
       </w:r>
-      <w:hyperlink r:id="rId20" w:anchor="F5" w:history="1">
+      <w:hyperlink r:id="rId19" w:anchor="F5" w:history="1">
         <w:r>
           <w:rPr>
             <w:rStyle w:val="Hyperlink"/>
@@ -1529,7 +1865,7 @@
       <w:r>
         <w:t xml:space="preserve"> the right to privacy over data. In using and training models with data taken from users, for example, there must be a consideration for the protection of this data. The susceptibility of models to attacks can include the threat of information or data theft [</w:t>
       </w:r>
-      <w:hyperlink r:id="rId21" w:anchor="ref-CR6" w:tooltip="Greshake, K., Abdelnabi, S., Mishra, S., Endres, C., Holz, T., Fritz, M.: More than you’ve asked for: A Comprehensive Analysis of Novel Prompt Injection Threats to Application-Integrated Large Language Models. arXiv preprint arXiv:2302.12173 (2023)" w:history="1">
+      <w:hyperlink r:id="rId20" w:anchor="ref-CR6" w:tooltip="Greshake, K., Abdelnabi, S., Mishra, S., Endres, C., Holz, T., Fritz, M.: More than you’ve asked for: A Comprehensive Analysis of Novel Prompt Injection Threats to Application-Integrated Large Language Models. arXiv preprint arXiv:2302.12173 (2023)" w:history="1">
         <w:r>
           <w:rPr>
             <w:rStyle w:val="Hyperlink"/>
@@ -1550,7 +1886,7 @@
           <w:numId w:val="14"/>
         </w:numPr>
       </w:pPr>
-      <w:hyperlink r:id="rId22" w:history="1">
+      <w:hyperlink r:id="rId21" w:history="1">
         <w:r>
           <w:rPr>
             <w:rStyle w:val="Hyperlink"/>
@@ -1600,7 +1936,7 @@
           <w:lang w:val="en-US"/>
         </w:rPr>
       </w:pPr>
-      <w:hyperlink r:id="rId23" w:history="1">
+      <w:hyperlink r:id="rId22" w:history="1">
         <w:r>
           <w:rPr>
             <w:rStyle w:val="Hyperlink"/>
@@ -1629,7 +1965,7 @@
       <w:r>
         <w:t xml:space="preserve"> cited as a potential risk. This includes the risk of data breaches or unauthorised access to user conversations as well as the risk of staff putting sensitive information into the program [</w:t>
       </w:r>
-      <w:hyperlink r:id="rId24" w:anchor="ref-CR56" w:tooltip="Gupta, M., Akiri, C., Aryal, K., Parker, E., Praharaj, L.: From ChatGPT to ThreatGPT: Impact of generative AI in cybersecurity and privacy. IEEE Access. (2023)" w:history="1">
+      <w:hyperlink r:id="rId23" w:anchor="ref-CR56" w:tooltip="Gupta, M., Akiri, C., Aryal, K., Parker, E., Praharaj, L.: From ChatGPT to ThreatGPT: Impact of generative AI in cybersecurity and privacy. IEEE Access. (2023)" w:history="1">
         <w:r>
           <w:rPr>
             <w:rStyle w:val="Hyperlink"/>
@@ -1651,7 +1987,7 @@
       <w:r>
         <w:t>While AI presents certain risks as we will outline in the following sections, it also opens beneficial opportunities for business such as the potential to increase productivity and reduce workloads on staff [</w:t>
       </w:r>
-      <w:hyperlink r:id="rId25" w:anchor="ref-CR5" w:tooltip="Brynjolfsson, E., Li, D., Raymond, L.: Generative AI at Work. National Bureau of Economic Research (2023)" w:history="1">
+      <w:hyperlink r:id="rId24" w:anchor="ref-CR5" w:tooltip="Brynjolfsson, E., Li, D., Raymond, L.: Generative AI at Work. National Bureau of Economic Research (2023)" w:history="1">
         <w:r>
           <w:rPr>
             <w:rStyle w:val="Hyperlink"/>
@@ -1674,7 +2010,7 @@
       <w:r>
         <w:t> As an ever-increasing amount of data is gathered and stored about us, there is also an increasing obligation for companies to keep that information secure. The spate of large-scale hacks where private and sensitive information has been leaked has sparked calls for greater responsibility to be taken by companies who handle and store such data [</w:t>
       </w:r>
-      <w:hyperlink r:id="rId26" w:anchor="ref-CR66" w:tooltip="Spinello, R.A.: Corporate Data breaches: A Moral and Legal Analysis. J. Inform. Ethics. 30, 12–32 (2021). &#10;                  https://doi.org/https://doi.org/&#10;                  &#10;                &#10;                  https://doi.org/10.2307/JIE.30.1.12&#10;            " w:history="1">
+      <w:hyperlink r:id="rId25" w:anchor="ref-CR66" w:tooltip="Spinello, R.A.: Corporate Data breaches: A Moral and Legal Analysis. J. Inform. Ethics. 30, 12–32 (2021). &#10;                  https://doi.org/https://doi.org/&#10;                  &#10;                &#10;                  https://doi.org/10.2307/JIE.30.1.12&#10;            " w:history="1">
         <w:r>
           <w:rPr>
             <w:rStyle w:val="Hyperlink"/>
@@ -1714,6 +2050,17 @@
     <w:p>
       <w:r>
         <w:t>Early test attacks on GTP-2 showed that it was possible for adversaries to extract specific examples of training data just by querying large language models [</w:t>
+      </w:r>
+      <w:hyperlink r:id="rId26" w:anchor="ref-CR3" w:tooltip="Carlini, N., Tramèr, F., Wallace, E., Jagielski, M., Herbert-Voss, A., Lee, K., Roberts, A., Brown, T.B., Song, D.X., Erlingsson, Ú., Oprea, A., Raffel, C.: Extracting Training Data from Large Language Models. In: USENIX Security Symposium. (2020)" w:history="1">
+        <w:r>
+          <w:rPr>
+            <w:rStyle w:val="Hyperlink"/>
+          </w:rPr>
+          <w:t>3</w:t>
+        </w:r>
+      </w:hyperlink>
+      <w:r>
+        <w:t>]. The test showed the possibility of extracting exact words and phrases used in the training of the model, alarmingly this included public personally identifiable information such as names, phone numbers and email addresses [</w:t>
       </w:r>
       <w:hyperlink r:id="rId27" w:anchor="ref-CR3" w:tooltip="Carlini, N., Tramèr, F., Wallace, E., Jagielski, M., Herbert-Voss, A., Lee, K., Roberts, A., Brown, T.B., Song, D.X., Erlingsson, Ú., Oprea, A., Raffel, C.: Extracting Training Data from Large Language Models. In: USENIX Security Symposium. (2020)" w:history="1">
         <w:r>
@@ -1724,20 +2071,9 @@
         </w:r>
       </w:hyperlink>
       <w:r>
-        <w:t>]. The test showed the possibility of extracting exact words and phrases used in the training of the model, alarmingly this included public personally identifiable information such as names, phone numbers and email addresses [</w:t>
-      </w:r>
-      <w:hyperlink r:id="rId28" w:anchor="ref-CR3" w:tooltip="Carlini, N., Tramèr, F., Wallace, E., Jagielski, M., Herbert-Voss, A., Lee, K., Roberts, A., Brown, T.B., Song, D.X., Erlingsson, Ú., Oprea, A., Raffel, C.: Extracting Training Data from Large Language Models. In: USENIX Security Symposium. (2020)" w:history="1">
-        <w:r>
-          <w:rPr>
-            <w:rStyle w:val="Hyperlink"/>
-          </w:rPr>
-          <w:t>3</w:t>
-        </w:r>
-      </w:hyperlink>
-      <w:r>
         <w:t>]. This information only needed to appear once in the training data. In February 2023, a Harvard University student used a ‘prompt injection’ attack on Bing chat to gain access to a document otherwise hidden to users [</w:t>
       </w:r>
-      <w:hyperlink r:id="rId29" w:anchor="ref-CR75" w:tooltip="Edwards, B.: AI-powered Bing Chat spills its secrets via prompt injection attack (2023). &#10;                  https://arstechnica.com/information-technology/2023/02/ai-powered-bing-chat-spills-its-secrets-via-prompt-injection-attack/&#10;                  &#10;         " w:history="1">
+      <w:hyperlink r:id="rId28" w:anchor="ref-CR75" w:tooltip="Edwards, B.: AI-powered Bing Chat spills its secrets via prompt injection attack (2023). &#10;                  https://arstechnica.com/information-technology/2023/02/ai-powered-bing-chat-spills-its-secrets-via-prompt-injection-attack/&#10;                  &#10;         " w:history="1">
         <w:r>
           <w:rPr>
             <w:rStyle w:val="Hyperlink"/>
@@ -1765,7 +2101,7 @@
       <w:r>
         <w:t>he second factor we identify is what we term as over-trust in generative AI systems. This refers to the degree to which users trust a model with sensitive information, or trust that it is safe and secure. Studies have found that a proportion of employees have pasted sensitive information into ChatGPT [</w:t>
       </w:r>
-      <w:hyperlink r:id="rId30" w:anchor="ref-CR87" w:tooltip="Cameron, C.: 11% of data employees paste into ChatGPT is confidential (2023). &#10;                  https://www.cyberhaven.com/blog/4-2-of-workers-have-pasted-company-data-into-chatgpt&#10;                  &#10;                . Accessed 23 November 2023" w:history="1">
+      <w:hyperlink r:id="rId29" w:anchor="ref-CR87" w:tooltip="Cameron, C.: 11% of data employees paste into ChatGPT is confidential (2023). &#10;                  https://www.cyberhaven.com/blog/4-2-of-workers-have-pasted-company-data-into-chatgpt&#10;                  &#10;                . Accessed 23 November 2023" w:history="1">
         <w:r>
           <w:rPr>
             <w:rStyle w:val="Hyperlink"/>
@@ -1806,6 +2142,17 @@
     <w:p>
       <w:r>
         <w:t>In terms of beneficence, there are many positive benefits for the training of generative AI and large language models on proprietary content or knowledge [</w:t>
+      </w:r>
+      <w:hyperlink r:id="rId30" w:anchor="ref-CR89" w:tooltip="Davenport, T., Alavi, M.: How to Train Generative AI Using Your Company’s Data (2023). &#10;                  https://hbr.org/2023/07/how-to-train-generative-ai-using-your-companys-data&#10;                  &#10;                . Accessed 27 November 2023" w:history="1">
+        <w:r>
+          <w:rPr>
+            <w:rStyle w:val="Hyperlink"/>
+          </w:rPr>
+          <w:t>89</w:t>
+        </w:r>
+      </w:hyperlink>
+      <w:r>
+        <w:t>]. This can be useful in assisting customer-facing employees find information about company policy, solving customer problems, or keeping employee knowledge when they leave the organisation [</w:t>
       </w:r>
       <w:hyperlink r:id="rId31" w:anchor="ref-CR89" w:tooltip="Davenport, T., Alavi, M.: How to Train Generative AI Using Your Company’s Data (2023). &#10;                  https://hbr.org/2023/07/how-to-train-generative-ai-using-your-companys-data&#10;                  &#10;                . Accessed 27 November 2023" w:history="1">
         <w:r>
@@ -1816,17 +2163,6 @@
         </w:r>
       </w:hyperlink>
       <w:r>
-        <w:t>]. This can be useful in assisting customer-facing employees find information about company policy, solving customer problems, or keeping employee knowledge when they leave the organisation [</w:t>
-      </w:r>
-      <w:hyperlink r:id="rId32" w:anchor="ref-CR89" w:tooltip="Davenport, T., Alavi, M.: How to Train Generative AI Using Your Company’s Data (2023). &#10;                  https://hbr.org/2023/07/how-to-train-generative-ai-using-your-companys-data&#10;                  &#10;                . Accessed 27 November 2023" w:history="1">
-        <w:r>
-          <w:rPr>
-            <w:rStyle w:val="Hyperlink"/>
-          </w:rPr>
-          <w:t>89</w:t>
-        </w:r>
-      </w:hyperlink>
-      <w:r>
         <w:t xml:space="preserve">]. In implementing such a strategy, companies and staff must have best practises in </w:t>
       </w:r>
       <w:proofErr w:type="gramStart"/>
@@ -1870,7 +2206,7 @@
           <w:numId w:val="7"/>
         </w:numPr>
       </w:pPr>
-      <w:hyperlink r:id="rId33" w:history="1">
+      <w:hyperlink r:id="rId32" w:history="1">
         <w:r>
           <w:rPr>
             <w:rStyle w:val="Hyperlink"/>
@@ -1884,7 +2220,7 @@
       <w:r>
         <w:t>Instead of combining critical thinking and their own insights into a problem along with an AI model, people frequently over-rely on the AI even if they would have made a better choice on their own [</w:t>
       </w:r>
-      <w:hyperlink r:id="rId34" w:anchor="ref-CR77" w:tooltip="Buçinca, Z., B Malaya, M., Z Gajos, K.: To trust or to think: Cognitive forcing functions can reduce overreliance on AI in AI-assisted decision-making. Proc. ACM Hum. -Comput Interact. 5, Article188 (2021). &#10;                  https://doi.org/10.1145/3449287&#10;  " w:history="1">
+      <w:hyperlink r:id="rId33" w:anchor="ref-CR77" w:tooltip="Buçinca, Z., B Malaya, M., Z Gajos, K.: To trust or to think: Cognitive forcing functions can reduce overreliance on AI in AI-assisted decision-making. Proc. ACM Hum. -Comput Interact. 5, Article188 (2021). &#10;                  https://doi.org/10.1145/3449287&#10;  " w:history="1">
         <w:r>
           <w:rPr>
             <w:rStyle w:val="Hyperlink"/>
@@ -1907,7 +2243,7 @@
       <w:r>
         <w:t>For example, over-relying on generative AI in coding can serve as a more immediate cyber security threat, as past versions of GitHub’s Copilot were found to recommend insecure and vulnerable code to developers [</w:t>
       </w:r>
-      <w:hyperlink r:id="rId35" w:anchor="ref-CR81" w:tooltip="Pearce, H., Ahmad, B., Tan, B., Dolan-Gavitt, B., Karri, R.: Asleep at the keyboard? assessing the security of github copilot’s code contributions. In: 2022 IEEE Symposium on Security and Privacy (SP), pp. 754–768. IEEE, (2022)" w:history="1">
+      <w:hyperlink r:id="rId34" w:anchor="ref-CR81" w:tooltip="Pearce, H., Ahmad, B., Tan, B., Dolan-Gavitt, B., Karri, R.: Asleep at the keyboard? assessing the security of github copilot’s code contributions. In: 2022 IEEE Symposium on Security and Privacy (SP), pp. 754–768. IEEE, (2022)" w:history="1">
         <w:r>
           <w:rPr>
             <w:rStyle w:val="Hyperlink"/>
@@ -1943,7 +2279,7 @@
           <w:numId w:val="7"/>
         </w:numPr>
       </w:pPr>
-      <w:hyperlink r:id="rId36" w:history="1">
+      <w:hyperlink r:id="rId35" w:history="1">
         <w:r>
           <w:rPr>
             <w:rStyle w:val="Hyperlink"/>
@@ -1953,7 +2289,7 @@
       </w:hyperlink>
     </w:p>
     <w:p>
-      <w:hyperlink r:id="rId37" w:history="1">
+      <w:hyperlink r:id="rId36" w:history="1">
         <w:r>
           <w:rPr>
             <w:rStyle w:val="Hyperlink"/>
@@ -2011,7 +2347,7 @@
           <w:numId w:val="6"/>
         </w:numPr>
       </w:pPr>
-      <w:hyperlink r:id="rId38" w:history="1">
+      <w:hyperlink r:id="rId37" w:history="1">
         <w:r>
           <w:rPr>
             <w:rStyle w:val="Hyperlink"/>
@@ -2025,7 +2361,7 @@
       <w:r>
         <w:t>Generative AI provides a distinct ethical consideration regarding autonomy. Data scraping for training AI models takes away the autonomy of individuals to choose to have their data used, possibly infringing on privacy and intellectual property rights. One such example is an artist having their work used to train a model which can subsequently generate new simulated works matching their unique style [</w:t>
       </w:r>
-      <w:hyperlink r:id="rId39" w:anchor="ref-CR64" w:tooltip="Franceschelli, G., Musolesi, M.: Copyright in generative deep learning. Data Policy 4, e17 (2022)" w:history="1">
+      <w:hyperlink r:id="rId38" w:anchor="ref-CR64" w:tooltip="Franceschelli, G., Musolesi, M.: Copyright in generative deep learning. Data Policy 4, e17 (2022)" w:history="1">
         <w:r>
           <w:rPr>
             <w:rStyle w:val="Hyperlink"/>
@@ -2063,7 +2399,7 @@
           <w:numId w:val="6"/>
         </w:numPr>
       </w:pPr>
-      <w:hyperlink r:id="rId40" w:history="1">
+      <w:hyperlink r:id="rId39" w:history="1">
         <w:r>
           <w:rPr>
             <w:rStyle w:val="Hyperlink"/>
@@ -2142,7 +2478,7 @@
           <w:lang w:val="en-US"/>
         </w:rPr>
       </w:pPr>
-      <w:hyperlink r:id="rId41" w:history="1">
+      <w:hyperlink r:id="rId40" w:history="1">
         <w:r>
           <w:rPr>
             <w:rStyle w:val="Hyperlink"/>
@@ -2271,14 +2607,112 @@
           <w:lang w:val="en-US"/>
         </w:rPr>
       </w:pPr>
+      <w:r>
+        <w:rPr>
+          <w:lang w:val="en-US"/>
+        </w:rPr>
+        <w:br w:type="page"/>
+      </w:r>
+    </w:p>
+    <w:p>
+      <w:pPr>
+        <w:rPr>
+          <w:lang w:val="en-US"/>
+        </w:rPr>
+      </w:pPr>
+      <w:r>
+        <w:rPr>
+          <w:lang w:val="en-US"/>
+        </w:rPr>
+        <w:lastRenderedPageBreak/>
+        <w:t xml:space="preserve">REFERENCE LIST </w:t>
+      </w:r>
+    </w:p>
+    <w:p>
+      <w:pPr>
+        <w:rPr>
+          <w:lang w:val="en-US"/>
+        </w:rPr>
+      </w:pPr>
+    </w:p>
+    <w:p>
+      <w:r>
+        <w:t>[1]</w:t>
+      </w:r>
+      <w:r>
+        <w:t xml:space="preserve"> </w:t>
+      </w:r>
+      <w:r>
+        <w:t xml:space="preserve">M. Haenlein, M.-H. Huang, and A. Kaplan, “Guest Editorial: Business Ethics in the Era of Artificial Intelligence,” </w:t>
+      </w:r>
+      <w:r>
+        <w:rPr>
+          <w:i/>
+          <w:iCs/>
+        </w:rPr>
+        <w:t>Journal of Business Ethics</w:t>
+      </w:r>
+      <w:r>
+        <w:t xml:space="preserve">, vol. 178, Feb. 2022, </w:t>
+      </w:r>
+      <w:proofErr w:type="spellStart"/>
+      <w:r>
+        <w:t>doi</w:t>
+      </w:r>
+      <w:proofErr w:type="spellEnd"/>
+      <w:r>
+        <w:t>: 10.1007/s10551-022-05060-x.</w:t>
+      </w:r>
+    </w:p>
+    <w:p>
+      <w:r>
+        <w:t xml:space="preserve">[2] </w:t>
+      </w:r>
+      <w:r>
+        <w:t xml:space="preserve">J. P. </w:t>
+      </w:r>
+      <w:proofErr w:type="spellStart"/>
+      <w:r>
+        <w:t>Bharadiya</w:t>
+      </w:r>
+      <w:proofErr w:type="spellEnd"/>
+      <w:r>
+        <w:t xml:space="preserve">, R. K. Thomas, F. Ahmed, University of the Cumberlands, Swiss School of Business and Management, and Mid Sweden University, “Rise of artificial intelligence in business and industry,” </w:t>
+      </w:r>
+      <w:r>
+        <w:rPr>
+          <w:i/>
+          <w:iCs/>
+        </w:rPr>
+        <w:t>Journal of Engineering Research and Reports</w:t>
+      </w:r>
+      <w:r>
+        <w:t xml:space="preserve">, vol. 25, no. 3, pp. 85–103, 2023, </w:t>
+      </w:r>
+      <w:proofErr w:type="spellStart"/>
+      <w:r>
+        <w:t>doi</w:t>
+      </w:r>
+      <w:proofErr w:type="spellEnd"/>
+      <w:r>
+        <w:t>: 10.9734/JERR/2023/v25i3893.</w:t>
+      </w:r>
+    </w:p>
+    <w:p/>
+    <w:p>
+      <w:pPr>
+        <w:rPr>
+          <w:lang w:val="en-US"/>
+        </w:rPr>
+      </w:pPr>
     </w:p>
     <w:sectPr>
-      <w:headerReference w:type="even" r:id="rId42"/>
-      <w:headerReference w:type="default" r:id="rId43"/>
-      <w:footerReference w:type="even" r:id="rId44"/>
-      <w:footerReference w:type="default" r:id="rId45"/>
-      <w:headerReference w:type="first" r:id="rId46"/>
-      <w:footerReference w:type="first" r:id="rId47"/>
+      <w:headerReference w:type="even" r:id="rId41"/>
+      <w:headerReference w:type="default" r:id="rId42"/>
+      <w:footerReference w:type="even" r:id="rId43"/>
+      <w:footerReference w:type="default" r:id="rId44"/>
+      <w:headerReference w:type="first" r:id="rId45"/>
+      <w:footerReference w:type="first" r:id="rId46"/>
       <w:pgSz w:w="11906" w:h="16838"/>
       <w:pgMar w:top="1440" w:right="1440" w:bottom="1440" w:left="1440" w:header="708" w:footer="708" w:gutter="0"/>
       <w:cols w:space="708"/>
@@ -2603,6 +3037,155 @@
     </w:lvl>
   </w:abstractNum>
   <w:abstractNum w:abstractNumId="2" w15:restartNumberingAfterBreak="0">
+    <w:nsid w:val="0AA76075"/>
+    <w:multiLevelType w:val="multilevel"/>
+    <w:tmpl w:val="49F49F18"/>
+    <w:lvl w:ilvl="0">
+      <w:start w:val="1"/>
+      <w:numFmt w:val="bullet"/>
+      <w:lvlText w:val=""/>
+      <w:lvlJc w:val="left"/>
+      <w:pPr>
+        <w:tabs>
+          <w:tab w:val="num" w:pos="720"/>
+        </w:tabs>
+        <w:ind w:left="720" w:hanging="360"/>
+      </w:pPr>
+      <w:rPr>
+        <w:rFonts w:ascii="Symbol" w:hAnsi="Symbol" w:hint="default"/>
+        <w:sz w:val="20"/>
+      </w:rPr>
+    </w:lvl>
+    <w:lvl w:ilvl="1" w:tentative="1">
+      <w:start w:val="1"/>
+      <w:numFmt w:val="bullet"/>
+      <w:lvlText w:val="o"/>
+      <w:lvlJc w:val="left"/>
+      <w:pPr>
+        <w:tabs>
+          <w:tab w:val="num" w:pos="1440"/>
+        </w:tabs>
+        <w:ind w:left="1440" w:hanging="360"/>
+      </w:pPr>
+      <w:rPr>
+        <w:rFonts w:ascii="Courier New" w:hAnsi="Courier New" w:hint="default"/>
+        <w:sz w:val="20"/>
+      </w:rPr>
+    </w:lvl>
+    <w:lvl w:ilvl="2" w:tentative="1">
+      <w:start w:val="1"/>
+      <w:numFmt w:val="bullet"/>
+      <w:lvlText w:val=""/>
+      <w:lvlJc w:val="left"/>
+      <w:pPr>
+        <w:tabs>
+          <w:tab w:val="num" w:pos="2160"/>
+        </w:tabs>
+        <w:ind w:left="2160" w:hanging="360"/>
+      </w:pPr>
+      <w:rPr>
+        <w:rFonts w:ascii="Wingdings" w:hAnsi="Wingdings" w:hint="default"/>
+        <w:sz w:val="20"/>
+      </w:rPr>
+    </w:lvl>
+    <w:lvl w:ilvl="3" w:tentative="1">
+      <w:start w:val="1"/>
+      <w:numFmt w:val="bullet"/>
+      <w:lvlText w:val=""/>
+      <w:lvlJc w:val="left"/>
+      <w:pPr>
+        <w:tabs>
+          <w:tab w:val="num" w:pos="2880"/>
+        </w:tabs>
+        <w:ind w:left="2880" w:hanging="360"/>
+      </w:pPr>
+      <w:rPr>
+        <w:rFonts w:ascii="Wingdings" w:hAnsi="Wingdings" w:hint="default"/>
+        <w:sz w:val="20"/>
+      </w:rPr>
+    </w:lvl>
+    <w:lvl w:ilvl="4" w:tentative="1">
+      <w:start w:val="1"/>
+      <w:numFmt w:val="bullet"/>
+      <w:lvlText w:val=""/>
+      <w:lvlJc w:val="left"/>
+      <w:pPr>
+        <w:tabs>
+          <w:tab w:val="num" w:pos="3600"/>
+        </w:tabs>
+        <w:ind w:left="3600" w:hanging="360"/>
+      </w:pPr>
+      <w:rPr>
+        <w:rFonts w:ascii="Wingdings" w:hAnsi="Wingdings" w:hint="default"/>
+        <w:sz w:val="20"/>
+      </w:rPr>
+    </w:lvl>
+    <w:lvl w:ilvl="5" w:tentative="1">
+      <w:start w:val="1"/>
+      <w:numFmt w:val="bullet"/>
+      <w:lvlText w:val=""/>
+      <w:lvlJc w:val="left"/>
+      <w:pPr>
+        <w:tabs>
+          <w:tab w:val="num" w:pos="4320"/>
+        </w:tabs>
+        <w:ind w:left="4320" w:hanging="360"/>
+      </w:pPr>
+      <w:rPr>
+        <w:rFonts w:ascii="Wingdings" w:hAnsi="Wingdings" w:hint="default"/>
+        <w:sz w:val="20"/>
+      </w:rPr>
+    </w:lvl>
+    <w:lvl w:ilvl="6" w:tentative="1">
+      <w:start w:val="1"/>
+      <w:numFmt w:val="bullet"/>
+      <w:lvlText w:val=""/>
+      <w:lvlJc w:val="left"/>
+      <w:pPr>
+        <w:tabs>
+          <w:tab w:val="num" w:pos="5040"/>
+        </w:tabs>
+        <w:ind w:left="5040" w:hanging="360"/>
+      </w:pPr>
+      <w:rPr>
+        <w:rFonts w:ascii="Wingdings" w:hAnsi="Wingdings" w:hint="default"/>
+        <w:sz w:val="20"/>
+      </w:rPr>
+    </w:lvl>
+    <w:lvl w:ilvl="7" w:tentative="1">
+      <w:start w:val="1"/>
+      <w:numFmt w:val="bullet"/>
+      <w:lvlText w:val=""/>
+      <w:lvlJc w:val="left"/>
+      <w:pPr>
+        <w:tabs>
+          <w:tab w:val="num" w:pos="5760"/>
+        </w:tabs>
+        <w:ind w:left="5760" w:hanging="360"/>
+      </w:pPr>
+      <w:rPr>
+        <w:rFonts w:ascii="Wingdings" w:hAnsi="Wingdings" w:hint="default"/>
+        <w:sz w:val="20"/>
+      </w:rPr>
+    </w:lvl>
+    <w:lvl w:ilvl="8" w:tentative="1">
+      <w:start w:val="1"/>
+      <w:numFmt w:val="bullet"/>
+      <w:lvlText w:val=""/>
+      <w:lvlJc w:val="left"/>
+      <w:pPr>
+        <w:tabs>
+          <w:tab w:val="num" w:pos="6480"/>
+        </w:tabs>
+        <w:ind w:left="6480" w:hanging="360"/>
+      </w:pPr>
+      <w:rPr>
+        <w:rFonts w:ascii="Wingdings" w:hAnsi="Wingdings" w:hint="default"/>
+        <w:sz w:val="20"/>
+      </w:rPr>
+    </w:lvl>
+  </w:abstractNum>
+  <w:abstractNum w:abstractNumId="3" w15:restartNumberingAfterBreak="0">
     <w:nsid w:val="1091429A"/>
     <w:multiLevelType w:val="hybridMultilevel"/>
     <w:tmpl w:val="F17A7106"/>
@@ -2691,7 +3274,7 @@
       </w:pPr>
     </w:lvl>
   </w:abstractNum>
-  <w:abstractNum w:abstractNumId="3" w15:restartNumberingAfterBreak="0">
+  <w:abstractNum w:abstractNumId="4" w15:restartNumberingAfterBreak="0">
     <w:nsid w:val="12BB39CB"/>
     <w:multiLevelType w:val="multilevel"/>
     <w:tmpl w:val="E034D4EE"/>
@@ -2804,7 +3387,7 @@
       </w:pPr>
     </w:lvl>
   </w:abstractNum>
-  <w:abstractNum w:abstractNumId="4" w15:restartNumberingAfterBreak="0">
+  <w:abstractNum w:abstractNumId="5" w15:restartNumberingAfterBreak="0">
     <w:nsid w:val="19687281"/>
     <w:multiLevelType w:val="hybridMultilevel"/>
     <w:tmpl w:val="BF6C1E3A"/>
@@ -2893,7 +3476,7 @@
       </w:pPr>
     </w:lvl>
   </w:abstractNum>
-  <w:abstractNum w:abstractNumId="5" w15:restartNumberingAfterBreak="0">
+  <w:abstractNum w:abstractNumId="6" w15:restartNumberingAfterBreak="0">
     <w:nsid w:val="250269B2"/>
     <w:multiLevelType w:val="hybridMultilevel"/>
     <w:tmpl w:val="B9E876B2"/>
@@ -2982,7 +3565,7 @@
       </w:pPr>
     </w:lvl>
   </w:abstractNum>
-  <w:abstractNum w:abstractNumId="6" w15:restartNumberingAfterBreak="0">
+  <w:abstractNum w:abstractNumId="7" w15:restartNumberingAfterBreak="0">
     <w:nsid w:val="302D66D9"/>
     <w:multiLevelType w:val="hybridMultilevel"/>
     <w:tmpl w:val="CAE8DF7A"/>
@@ -3095,7 +3678,7 @@
       </w:rPr>
     </w:lvl>
   </w:abstractNum>
-  <w:abstractNum w:abstractNumId="7" w15:restartNumberingAfterBreak="0">
+  <w:abstractNum w:abstractNumId="8" w15:restartNumberingAfterBreak="0">
     <w:nsid w:val="3E520B07"/>
     <w:multiLevelType w:val="multilevel"/>
     <w:tmpl w:val="5538A052"/>
@@ -3208,7 +3791,7 @@
       </w:pPr>
     </w:lvl>
   </w:abstractNum>
-  <w:abstractNum w:abstractNumId="8" w15:restartNumberingAfterBreak="0">
+  <w:abstractNum w:abstractNumId="9" w15:restartNumberingAfterBreak="0">
     <w:nsid w:val="43096C79"/>
     <w:multiLevelType w:val="multilevel"/>
     <w:tmpl w:val="6346D42A"/>
@@ -3321,7 +3904,156 @@
       </w:pPr>
     </w:lvl>
   </w:abstractNum>
-  <w:abstractNum w:abstractNumId="9" w15:restartNumberingAfterBreak="0">
+  <w:abstractNum w:abstractNumId="10" w15:restartNumberingAfterBreak="0">
+    <w:nsid w:val="4A846C17"/>
+    <w:multiLevelType w:val="multilevel"/>
+    <w:tmpl w:val="E46CB386"/>
+    <w:lvl w:ilvl="0">
+      <w:start w:val="1"/>
+      <w:numFmt w:val="bullet"/>
+      <w:lvlText w:val=""/>
+      <w:lvlJc w:val="left"/>
+      <w:pPr>
+        <w:tabs>
+          <w:tab w:val="num" w:pos="720"/>
+        </w:tabs>
+        <w:ind w:left="720" w:hanging="360"/>
+      </w:pPr>
+      <w:rPr>
+        <w:rFonts w:ascii="Symbol" w:hAnsi="Symbol" w:hint="default"/>
+        <w:sz w:val="20"/>
+      </w:rPr>
+    </w:lvl>
+    <w:lvl w:ilvl="1" w:tentative="1">
+      <w:start w:val="1"/>
+      <w:numFmt w:val="bullet"/>
+      <w:lvlText w:val="o"/>
+      <w:lvlJc w:val="left"/>
+      <w:pPr>
+        <w:tabs>
+          <w:tab w:val="num" w:pos="1440"/>
+        </w:tabs>
+        <w:ind w:left="1440" w:hanging="360"/>
+      </w:pPr>
+      <w:rPr>
+        <w:rFonts w:ascii="Courier New" w:hAnsi="Courier New" w:hint="default"/>
+        <w:sz w:val="20"/>
+      </w:rPr>
+    </w:lvl>
+    <w:lvl w:ilvl="2" w:tentative="1">
+      <w:start w:val="1"/>
+      <w:numFmt w:val="bullet"/>
+      <w:lvlText w:val=""/>
+      <w:lvlJc w:val="left"/>
+      <w:pPr>
+        <w:tabs>
+          <w:tab w:val="num" w:pos="2160"/>
+        </w:tabs>
+        <w:ind w:left="2160" w:hanging="360"/>
+      </w:pPr>
+      <w:rPr>
+        <w:rFonts w:ascii="Wingdings" w:hAnsi="Wingdings" w:hint="default"/>
+        <w:sz w:val="20"/>
+      </w:rPr>
+    </w:lvl>
+    <w:lvl w:ilvl="3" w:tentative="1">
+      <w:start w:val="1"/>
+      <w:numFmt w:val="bullet"/>
+      <w:lvlText w:val=""/>
+      <w:lvlJc w:val="left"/>
+      <w:pPr>
+        <w:tabs>
+          <w:tab w:val="num" w:pos="2880"/>
+        </w:tabs>
+        <w:ind w:left="2880" w:hanging="360"/>
+      </w:pPr>
+      <w:rPr>
+        <w:rFonts w:ascii="Wingdings" w:hAnsi="Wingdings" w:hint="default"/>
+        <w:sz w:val="20"/>
+      </w:rPr>
+    </w:lvl>
+    <w:lvl w:ilvl="4" w:tentative="1">
+      <w:start w:val="1"/>
+      <w:numFmt w:val="bullet"/>
+      <w:lvlText w:val=""/>
+      <w:lvlJc w:val="left"/>
+      <w:pPr>
+        <w:tabs>
+          <w:tab w:val="num" w:pos="3600"/>
+        </w:tabs>
+        <w:ind w:left="3600" w:hanging="360"/>
+      </w:pPr>
+      <w:rPr>
+        <w:rFonts w:ascii="Wingdings" w:hAnsi="Wingdings" w:hint="default"/>
+        <w:sz w:val="20"/>
+      </w:rPr>
+    </w:lvl>
+    <w:lvl w:ilvl="5" w:tentative="1">
+      <w:start w:val="1"/>
+      <w:numFmt w:val="bullet"/>
+      <w:lvlText w:val=""/>
+      <w:lvlJc w:val="left"/>
+      <w:pPr>
+        <w:tabs>
+          <w:tab w:val="num" w:pos="4320"/>
+        </w:tabs>
+        <w:ind w:left="4320" w:hanging="360"/>
+      </w:pPr>
+      <w:rPr>
+        <w:rFonts w:ascii="Wingdings" w:hAnsi="Wingdings" w:hint="default"/>
+        <w:sz w:val="20"/>
+      </w:rPr>
+    </w:lvl>
+    <w:lvl w:ilvl="6" w:tentative="1">
+      <w:start w:val="1"/>
+      <w:numFmt w:val="bullet"/>
+      <w:lvlText w:val=""/>
+      <w:lvlJc w:val="left"/>
+      <w:pPr>
+        <w:tabs>
+          <w:tab w:val="num" w:pos="5040"/>
+        </w:tabs>
+        <w:ind w:left="5040" w:hanging="360"/>
+      </w:pPr>
+      <w:rPr>
+        <w:rFonts w:ascii="Wingdings" w:hAnsi="Wingdings" w:hint="default"/>
+        <w:sz w:val="20"/>
+      </w:rPr>
+    </w:lvl>
+    <w:lvl w:ilvl="7" w:tentative="1">
+      <w:start w:val="1"/>
+      <w:numFmt w:val="bullet"/>
+      <w:lvlText w:val=""/>
+      <w:lvlJc w:val="left"/>
+      <w:pPr>
+        <w:tabs>
+          <w:tab w:val="num" w:pos="5760"/>
+        </w:tabs>
+        <w:ind w:left="5760" w:hanging="360"/>
+      </w:pPr>
+      <w:rPr>
+        <w:rFonts w:ascii="Wingdings" w:hAnsi="Wingdings" w:hint="default"/>
+        <w:sz w:val="20"/>
+      </w:rPr>
+    </w:lvl>
+    <w:lvl w:ilvl="8" w:tentative="1">
+      <w:start w:val="1"/>
+      <w:numFmt w:val="bullet"/>
+      <w:lvlText w:val=""/>
+      <w:lvlJc w:val="left"/>
+      <w:pPr>
+        <w:tabs>
+          <w:tab w:val="num" w:pos="6480"/>
+        </w:tabs>
+        <w:ind w:left="6480" w:hanging="360"/>
+      </w:pPr>
+      <w:rPr>
+        <w:rFonts w:ascii="Wingdings" w:hAnsi="Wingdings" w:hint="default"/>
+        <w:sz w:val="20"/>
+      </w:rPr>
+    </w:lvl>
+  </w:abstractNum>
+  <w:abstractNum w:abstractNumId="11" w15:restartNumberingAfterBreak="0">
     <w:nsid w:val="4D087D27"/>
     <w:multiLevelType w:val="hybridMultilevel"/>
     <w:tmpl w:val="28CEC8AA"/>
@@ -3410,7 +4142,7 @@
       </w:pPr>
     </w:lvl>
   </w:abstractNum>
-  <w:abstractNum w:abstractNumId="10" w15:restartNumberingAfterBreak="0">
+  <w:abstractNum w:abstractNumId="12" w15:restartNumberingAfterBreak="0">
     <w:nsid w:val="597817B0"/>
     <w:multiLevelType w:val="hybridMultilevel"/>
     <w:tmpl w:val="01C42A9C"/>
@@ -3522,7 +4254,7 @@
       </w:rPr>
     </w:lvl>
   </w:abstractNum>
-  <w:abstractNum w:abstractNumId="11" w15:restartNumberingAfterBreak="0">
+  <w:abstractNum w:abstractNumId="13" w15:restartNumberingAfterBreak="0">
     <w:nsid w:val="645D09BE"/>
     <w:multiLevelType w:val="hybridMultilevel"/>
     <w:tmpl w:val="CCCEA7BA"/>
@@ -3611,7 +4343,7 @@
       </w:pPr>
     </w:lvl>
   </w:abstractNum>
-  <w:abstractNum w:abstractNumId="12" w15:restartNumberingAfterBreak="0">
+  <w:abstractNum w:abstractNumId="14" w15:restartNumberingAfterBreak="0">
     <w:nsid w:val="67740BE8"/>
     <w:multiLevelType w:val="hybridMultilevel"/>
     <w:tmpl w:val="013E0B3A"/>
@@ -3700,7 +4432,7 @@
       </w:pPr>
     </w:lvl>
   </w:abstractNum>
-  <w:abstractNum w:abstractNumId="13" w15:restartNumberingAfterBreak="0">
+  <w:abstractNum w:abstractNumId="15" w15:restartNumberingAfterBreak="0">
     <w:nsid w:val="68F24AAB"/>
     <w:multiLevelType w:val="hybridMultilevel"/>
     <w:tmpl w:val="3098B45A"/>
@@ -3789,7 +4521,7 @@
       </w:pPr>
     </w:lvl>
   </w:abstractNum>
-  <w:abstractNum w:abstractNumId="14" w15:restartNumberingAfterBreak="0">
+  <w:abstractNum w:abstractNumId="16" w15:restartNumberingAfterBreak="0">
     <w:nsid w:val="6A4A6DED"/>
     <w:multiLevelType w:val="hybridMultilevel"/>
     <w:tmpl w:val="C9DA4C30"/>
@@ -3901,7 +4633,7 @@
       </w:rPr>
     </w:lvl>
   </w:abstractNum>
-  <w:abstractNum w:abstractNumId="15" w15:restartNumberingAfterBreak="0">
+  <w:abstractNum w:abstractNumId="17" w15:restartNumberingAfterBreak="0">
     <w:nsid w:val="6B44627A"/>
     <w:multiLevelType w:val="multilevel"/>
     <w:tmpl w:val="4A18E128"/>
@@ -4014,7 +4746,156 @@
       </w:pPr>
     </w:lvl>
   </w:abstractNum>
-  <w:abstractNum w:abstractNumId="16" w15:restartNumberingAfterBreak="0">
+  <w:abstractNum w:abstractNumId="18" w15:restartNumberingAfterBreak="0">
+    <w:nsid w:val="7549398C"/>
+    <w:multiLevelType w:val="multilevel"/>
+    <w:tmpl w:val="E58A720A"/>
+    <w:lvl w:ilvl="0">
+      <w:start w:val="1"/>
+      <w:numFmt w:val="bullet"/>
+      <w:lvlText w:val=""/>
+      <w:lvlJc w:val="left"/>
+      <w:pPr>
+        <w:tabs>
+          <w:tab w:val="num" w:pos="720"/>
+        </w:tabs>
+        <w:ind w:left="720" w:hanging="360"/>
+      </w:pPr>
+      <w:rPr>
+        <w:rFonts w:ascii="Symbol" w:hAnsi="Symbol" w:hint="default"/>
+        <w:sz w:val="20"/>
+      </w:rPr>
+    </w:lvl>
+    <w:lvl w:ilvl="1" w:tentative="1">
+      <w:start w:val="1"/>
+      <w:numFmt w:val="bullet"/>
+      <w:lvlText w:val="o"/>
+      <w:lvlJc w:val="left"/>
+      <w:pPr>
+        <w:tabs>
+          <w:tab w:val="num" w:pos="1440"/>
+        </w:tabs>
+        <w:ind w:left="1440" w:hanging="360"/>
+      </w:pPr>
+      <w:rPr>
+        <w:rFonts w:ascii="Courier New" w:hAnsi="Courier New" w:hint="default"/>
+        <w:sz w:val="20"/>
+      </w:rPr>
+    </w:lvl>
+    <w:lvl w:ilvl="2" w:tentative="1">
+      <w:start w:val="1"/>
+      <w:numFmt w:val="bullet"/>
+      <w:lvlText w:val=""/>
+      <w:lvlJc w:val="left"/>
+      <w:pPr>
+        <w:tabs>
+          <w:tab w:val="num" w:pos="2160"/>
+        </w:tabs>
+        <w:ind w:left="2160" w:hanging="360"/>
+      </w:pPr>
+      <w:rPr>
+        <w:rFonts w:ascii="Wingdings" w:hAnsi="Wingdings" w:hint="default"/>
+        <w:sz w:val="20"/>
+      </w:rPr>
+    </w:lvl>
+    <w:lvl w:ilvl="3" w:tentative="1">
+      <w:start w:val="1"/>
+      <w:numFmt w:val="bullet"/>
+      <w:lvlText w:val=""/>
+      <w:lvlJc w:val="left"/>
+      <w:pPr>
+        <w:tabs>
+          <w:tab w:val="num" w:pos="2880"/>
+        </w:tabs>
+        <w:ind w:left="2880" w:hanging="360"/>
+      </w:pPr>
+      <w:rPr>
+        <w:rFonts w:ascii="Wingdings" w:hAnsi="Wingdings" w:hint="default"/>
+        <w:sz w:val="20"/>
+      </w:rPr>
+    </w:lvl>
+    <w:lvl w:ilvl="4" w:tentative="1">
+      <w:start w:val="1"/>
+      <w:numFmt w:val="bullet"/>
+      <w:lvlText w:val=""/>
+      <w:lvlJc w:val="left"/>
+      <w:pPr>
+        <w:tabs>
+          <w:tab w:val="num" w:pos="3600"/>
+        </w:tabs>
+        <w:ind w:left="3600" w:hanging="360"/>
+      </w:pPr>
+      <w:rPr>
+        <w:rFonts w:ascii="Wingdings" w:hAnsi="Wingdings" w:hint="default"/>
+        <w:sz w:val="20"/>
+      </w:rPr>
+    </w:lvl>
+    <w:lvl w:ilvl="5" w:tentative="1">
+      <w:start w:val="1"/>
+      <w:numFmt w:val="bullet"/>
+      <w:lvlText w:val=""/>
+      <w:lvlJc w:val="left"/>
+      <w:pPr>
+        <w:tabs>
+          <w:tab w:val="num" w:pos="4320"/>
+        </w:tabs>
+        <w:ind w:left="4320" w:hanging="360"/>
+      </w:pPr>
+      <w:rPr>
+        <w:rFonts w:ascii="Wingdings" w:hAnsi="Wingdings" w:hint="default"/>
+        <w:sz w:val="20"/>
+      </w:rPr>
+    </w:lvl>
+    <w:lvl w:ilvl="6" w:tentative="1">
+      <w:start w:val="1"/>
+      <w:numFmt w:val="bullet"/>
+      <w:lvlText w:val=""/>
+      <w:lvlJc w:val="left"/>
+      <w:pPr>
+        <w:tabs>
+          <w:tab w:val="num" w:pos="5040"/>
+        </w:tabs>
+        <w:ind w:left="5040" w:hanging="360"/>
+      </w:pPr>
+      <w:rPr>
+        <w:rFonts w:ascii="Wingdings" w:hAnsi="Wingdings" w:hint="default"/>
+        <w:sz w:val="20"/>
+      </w:rPr>
+    </w:lvl>
+    <w:lvl w:ilvl="7" w:tentative="1">
+      <w:start w:val="1"/>
+      <w:numFmt w:val="bullet"/>
+      <w:lvlText w:val=""/>
+      <w:lvlJc w:val="left"/>
+      <w:pPr>
+        <w:tabs>
+          <w:tab w:val="num" w:pos="5760"/>
+        </w:tabs>
+        <w:ind w:left="5760" w:hanging="360"/>
+      </w:pPr>
+      <w:rPr>
+        <w:rFonts w:ascii="Wingdings" w:hAnsi="Wingdings" w:hint="default"/>
+        <w:sz w:val="20"/>
+      </w:rPr>
+    </w:lvl>
+    <w:lvl w:ilvl="8" w:tentative="1">
+      <w:start w:val="1"/>
+      <w:numFmt w:val="bullet"/>
+      <w:lvlText w:val=""/>
+      <w:lvlJc w:val="left"/>
+      <w:pPr>
+        <w:tabs>
+          <w:tab w:val="num" w:pos="6480"/>
+        </w:tabs>
+        <w:ind w:left="6480" w:hanging="360"/>
+      </w:pPr>
+      <w:rPr>
+        <w:rFonts w:ascii="Wingdings" w:hAnsi="Wingdings" w:hint="default"/>
+        <w:sz w:val="20"/>
+      </w:rPr>
+    </w:lvl>
+  </w:abstractNum>
+  <w:abstractNum w:abstractNumId="19" w15:restartNumberingAfterBreak="0">
     <w:nsid w:val="799111D3"/>
     <w:multiLevelType w:val="hybridMultilevel"/>
     <w:tmpl w:val="37B0E990"/>
@@ -4104,55 +4985,64 @@
     </w:lvl>
   </w:abstractNum>
   <w:num w:numId="1" w16cid:durableId="854225435">
-    <w:abstractNumId w:val="10"/>
+    <w:abstractNumId w:val="12"/>
   </w:num>
   <w:num w:numId="2" w16cid:durableId="1864054581">
-    <w:abstractNumId w:val="6"/>
+    <w:abstractNumId w:val="7"/>
   </w:num>
   <w:num w:numId="3" w16cid:durableId="689338242">
-    <w:abstractNumId w:val="14"/>
+    <w:abstractNumId w:val="16"/>
   </w:num>
   <w:num w:numId="4" w16cid:durableId="1549878278">
-    <w:abstractNumId w:val="4"/>
+    <w:abstractNumId w:val="5"/>
   </w:num>
   <w:num w:numId="5" w16cid:durableId="318775108">
     <w:abstractNumId w:val="1"/>
   </w:num>
   <w:num w:numId="6" w16cid:durableId="932128440">
-    <w:abstractNumId w:val="16"/>
+    <w:abstractNumId w:val="19"/>
   </w:num>
   <w:num w:numId="7" w16cid:durableId="1356150948">
-    <w:abstractNumId w:val="13"/>
+    <w:abstractNumId w:val="15"/>
   </w:num>
   <w:num w:numId="8" w16cid:durableId="52971523">
-    <w:abstractNumId w:val="7"/>
+    <w:abstractNumId w:val="8"/>
   </w:num>
   <w:num w:numId="9" w16cid:durableId="903370659">
-    <w:abstractNumId w:val="15"/>
+    <w:abstractNumId w:val="17"/>
   </w:num>
   <w:num w:numId="10" w16cid:durableId="2114667754">
-    <w:abstractNumId w:val="8"/>
+    <w:abstractNumId w:val="9"/>
   </w:num>
   <w:num w:numId="11" w16cid:durableId="1308970869">
     <w:abstractNumId w:val="0"/>
   </w:num>
   <w:num w:numId="12" w16cid:durableId="447159889">
+    <w:abstractNumId w:val="4"/>
+  </w:num>
+  <w:num w:numId="13" w16cid:durableId="1870415028">
+    <w:abstractNumId w:val="13"/>
+  </w:num>
+  <w:num w:numId="14" w16cid:durableId="369453745">
+    <w:abstractNumId w:val="6"/>
+  </w:num>
+  <w:num w:numId="15" w16cid:durableId="560554908">
+    <w:abstractNumId w:val="11"/>
+  </w:num>
+  <w:num w:numId="16" w16cid:durableId="1732120032">
     <w:abstractNumId w:val="3"/>
   </w:num>
-  <w:num w:numId="13" w16cid:durableId="1870415028">
-    <w:abstractNumId w:val="11"/>
+  <w:num w:numId="17" w16cid:durableId="27223933">
+    <w:abstractNumId w:val="14"/>
   </w:num>
-  <w:num w:numId="14" w16cid:durableId="369453745">
-    <w:abstractNumId w:val="5"/>
+  <w:num w:numId="18" w16cid:durableId="568030795">
+    <w:abstractNumId w:val="18"/>
   </w:num>
-  <w:num w:numId="15" w16cid:durableId="560554908">
-    <w:abstractNumId w:val="9"/>
-  </w:num>
-  <w:num w:numId="16" w16cid:durableId="1732120032">
+  <w:num w:numId="19" w16cid:durableId="2106030009">
     <w:abstractNumId w:val="2"/>
   </w:num>
-  <w:num w:numId="17" w16cid:durableId="27223933">
-    <w:abstractNumId w:val="12"/>
+  <w:num w:numId="20" w16cid:durableId="1565949543">
+    <w:abstractNumId w:val="10"/>
   </w:num>
 </w:numbering>
 </file>

</xml_diff>